<commit_message>
Ajout du fichier python
</commit_message>
<xml_diff>
--- a/Documentation/ProgetAEGIS.docx
+++ b/Documentation/ProgetAEGIS.docx
@@ -57,6 +57,7 @@
         </w:rPr>
         <w:t xml:space="preserve">BY </w:t>
       </w:r>
+      <w:proofErr w:type="spellStart"/>
       <w:r>
         <w:rPr>
           <w:b/>
@@ -65,12 +66,10 @@
           <w:szCs w:val="40"/>
           <w:lang w:val="en-US"/>
         </w:rPr>
-        <w:t>Toukam.I, Diomandé.Y, Dumorine.G</w:t>
-      </w:r>
-    </w:p>
-    <w:p>
-      <w:pPr>
-        <w:jc w:val="center"/>
+        <w:t>Toukam.I</w:t>
+      </w:r>
+      <w:proofErr w:type="spellEnd"/>
+      <w:r>
         <w:rPr>
           <w:b/>
           <w:bCs/>
@@ -78,11 +77,10 @@
           <w:szCs w:val="40"/>
           <w:lang w:val="en-US"/>
         </w:rPr>
-      </w:pPr>
-    </w:p>
-    <w:p>
-      <w:pPr>
-        <w:jc w:val="center"/>
+        <w:t xml:space="preserve">, </w:t>
+      </w:r>
+      <w:proofErr w:type="spellStart"/>
+      <w:r>
         <w:rPr>
           <w:b/>
           <w:bCs/>
@@ -90,11 +88,10 @@
           <w:szCs w:val="40"/>
           <w:lang w:val="en-US"/>
         </w:rPr>
-      </w:pPr>
-    </w:p>
-    <w:p>
-      <w:pPr>
-        <w:jc w:val="center"/>
+        <w:t>Diomandé.Y</w:t>
+      </w:r>
+      <w:proofErr w:type="spellEnd"/>
+      <w:r>
         <w:rPr>
           <w:b/>
           <w:bCs/>
@@ -102,11 +99,10 @@
           <w:szCs w:val="40"/>
           <w:lang w:val="en-US"/>
         </w:rPr>
-      </w:pPr>
-    </w:p>
-    <w:p>
-      <w:pPr>
-        <w:jc w:val="center"/>
+        <w:t xml:space="preserve">, </w:t>
+      </w:r>
+      <w:proofErr w:type="spellStart"/>
+      <w:r>
         <w:rPr>
           <w:b/>
           <w:bCs/>
@@ -114,7 +110,9 @@
           <w:szCs w:val="40"/>
           <w:lang w:val="en-US"/>
         </w:rPr>
-      </w:pPr>
+        <w:t>Dumorine.G</w:t>
+      </w:r>
+      <w:proofErr w:type="spellEnd"/>
     </w:p>
     <w:p>
       <w:pPr>
@@ -178,11 +176,83 @@
     </w:p>
     <w:p>
       <w:pPr>
+        <w:jc w:val="center"/>
         <w:rPr>
           <w:b/>
           <w:bCs/>
           <w:sz w:val="40"/>
           <w:szCs w:val="40"/>
+          <w:lang w:val="en-US"/>
+        </w:rPr>
+      </w:pPr>
+    </w:p>
+    <w:p>
+      <w:pPr>
+        <w:jc w:val="center"/>
+        <w:rPr>
+          <w:b/>
+          <w:bCs/>
+          <w:sz w:val="40"/>
+          <w:szCs w:val="40"/>
+          <w:lang w:val="en-US"/>
+        </w:rPr>
+      </w:pPr>
+    </w:p>
+    <w:p>
+      <w:pPr>
+        <w:jc w:val="center"/>
+        <w:rPr>
+          <w:b/>
+          <w:bCs/>
+          <w:sz w:val="40"/>
+          <w:szCs w:val="40"/>
+          <w:lang w:val="en-US"/>
+        </w:rPr>
+      </w:pPr>
+    </w:p>
+    <w:p>
+      <w:pPr>
+        <w:jc w:val="center"/>
+        <w:rPr>
+          <w:b/>
+          <w:bCs/>
+          <w:sz w:val="40"/>
+          <w:szCs w:val="40"/>
+          <w:lang w:val="en-US"/>
+        </w:rPr>
+      </w:pPr>
+    </w:p>
+    <w:p>
+      <w:pPr>
+        <w:rPr>
+          <w:b/>
+          <w:bCs/>
+          <w:sz w:val="40"/>
+          <w:szCs w:val="40"/>
+        </w:rPr>
+      </w:pPr>
+    </w:p>
+    <w:p>
+      <w:pPr>
+        <w:jc w:val="center"/>
+        <w:rPr>
+          <w:b/>
+          <w:bCs/>
+          <w:color w:val="156082" w:themeColor="accent1"/>
+          <w:sz w:val="96"/>
+          <w:szCs w:val="96"/>
+        </w:rPr>
+      </w:pPr>
+    </w:p>
+    <w:p>
+      <w:pPr>
+        <w:jc w:val="center"/>
+        <w:rPr>
+          <w:b/>
+          <w:bCs/>
+          <w:color w:val="156082" w:themeColor="accent1"/>
+          <w:sz w:val="96"/>
+          <w:szCs w:val="96"/>
         </w:rPr>
       </w:pPr>
     </w:p>
@@ -265,8 +335,20 @@
           <w:sz w:val="36"/>
           <w:szCs w:val="36"/>
         </w:rPr>
-        <w:t>Analyse du dossier TechSud</w:t>
-      </w:r>
+        <w:t xml:space="preserve">Analyse du dossier </w:t>
+      </w:r>
+      <w:proofErr w:type="spellStart"/>
+      <w:r>
+        <w:rPr>
+          <w:b/>
+          <w:bCs/>
+          <w:color w:val="0E2841" w:themeColor="text2"/>
+          <w:sz w:val="36"/>
+          <w:szCs w:val="36"/>
+        </w:rPr>
+        <w:t>TechSud</w:t>
+      </w:r>
+      <w:proofErr w:type="spellEnd"/>
     </w:p>
     <w:p>
       <w:pPr>
@@ -409,8 +491,20 @@
           <w:sz w:val="36"/>
           <w:szCs w:val="36"/>
         </w:rPr>
-        <w:t>Rapport d’audit TechSud</w:t>
-      </w:r>
+        <w:t xml:space="preserve">Rapport d’audit </w:t>
+      </w:r>
+      <w:proofErr w:type="spellStart"/>
+      <w:r>
+        <w:rPr>
+          <w:b/>
+          <w:bCs/>
+          <w:color w:val="0E2841" w:themeColor="text2"/>
+          <w:sz w:val="36"/>
+          <w:szCs w:val="36"/>
+        </w:rPr>
+        <w:t>TechSud</w:t>
+      </w:r>
+      <w:proofErr w:type="spellEnd"/>
     </w:p>
     <w:p>
       <w:pPr>
@@ -502,28 +596,6 @@
     </w:p>
     <w:p>
       <w:pPr>
-        <w:pStyle w:val="ListParagraph"/>
-        <w:rPr>
-          <w:color w:val="0E2841" w:themeColor="text2"/>
-          <w:sz w:val="52"/>
-          <w:szCs w:val="52"/>
-        </w:rPr>
-      </w:pPr>
-    </w:p>
-    <w:p>
-      <w:pPr>
-        <w:pStyle w:val="ListParagraph"/>
-        <w:rPr>
-          <w:color w:val="0E2841" w:themeColor="text2"/>
-          <w:sz w:val="52"/>
-          <w:szCs w:val="52"/>
-        </w:rPr>
-      </w:pPr>
-    </w:p>
-    <w:p>
-      <w:pPr>
-        <w:pStyle w:val="ListParagraph"/>
-        <w:ind w:left="1440"/>
         <w:rPr>
           <w:b/>
           <w:bCs/>
@@ -537,27 +609,36 @@
       <w:pPr>
         <w:pStyle w:val="ListParagraph"/>
         <w:ind w:left="1440"/>
+        <w:jc w:val="center"/>
         <w:rPr>
           <w:b/>
           <w:bCs/>
           <w:color w:val="156082" w:themeColor="accent1"/>
-          <w:sz w:val="96"/>
-          <w:szCs w:val="96"/>
-        </w:rPr>
-      </w:pPr>
-    </w:p>
-    <w:p>
-      <w:pPr>
-        <w:pStyle w:val="ListParagraph"/>
-        <w:ind w:left="1440"/>
+          <w:sz w:val="72"/>
+          <w:szCs w:val="72"/>
+        </w:rPr>
+      </w:pPr>
+      <w:r>
         <w:rPr>
           <w:b/>
           <w:bCs/>
           <w:color w:val="156082" w:themeColor="accent1"/>
-          <w:sz w:val="96"/>
-          <w:szCs w:val="96"/>
-        </w:rPr>
-      </w:pPr>
+          <w:sz w:val="72"/>
+          <w:szCs w:val="72"/>
+        </w:rPr>
+        <w:lastRenderedPageBreak/>
+        <w:t>INT</w:t>
+      </w:r>
+      <w:r>
+        <w:rPr>
+          <w:b/>
+          <w:bCs/>
+          <w:color w:val="156082" w:themeColor="accent1"/>
+          <w:sz w:val="72"/>
+          <w:szCs w:val="72"/>
+        </w:rPr>
+        <w:t>RODUCTION</w:t>
+      </w:r>
     </w:p>
     <w:p>
       <w:pPr>
@@ -572,40 +653,6 @@
           <w:szCs w:val="72"/>
         </w:rPr>
       </w:pPr>
-      <w:r>
-        <w:rPr>
-          <w:b/>
-          <w:bCs/>
-          <w:color w:val="156082" w:themeColor="accent1"/>
-          <w:sz w:val="72"/>
-          <w:szCs w:val="72"/>
-        </w:rPr>
-        <w:t>INT</w:t>
-      </w:r>
-      <w:r>
-        <w:rPr>
-          <w:b/>
-          <w:bCs/>
-          <w:color w:val="156082" w:themeColor="accent1"/>
-          <w:sz w:val="72"/>
-          <w:szCs w:val="72"/>
-        </w:rPr>
-        <w:t>RODUCTION</w:t>
-      </w:r>
-    </w:p>
-    <w:p>
-      <w:pPr>
-        <w:pStyle w:val="ListParagraph"/>
-        <w:ind w:left="1440"/>
-        <w:jc w:val="center"/>
-        <w:rPr>
-          <w:b/>
-          <w:bCs/>
-          <w:color w:val="156082" w:themeColor="accent1"/>
-          <w:sz w:val="72"/>
-          <w:szCs w:val="72"/>
-        </w:rPr>
-      </w:pPr>
     </w:p>
     <w:p>
       <w:pPr>
@@ -642,7 +689,25 @@
           <w:sz w:val="32"/>
           <w:szCs w:val="32"/>
         </w:rPr>
-        <w:t>Le 18 avril 2026, TechSud subit un incident critique</w:t>
+        <w:t xml:space="preserve">Le 18 avril 2026, </w:t>
+      </w:r>
+      <w:proofErr w:type="spellStart"/>
+      <w:r>
+        <w:rPr>
+          <w:color w:val="0E2841" w:themeColor="text2"/>
+          <w:sz w:val="32"/>
+          <w:szCs w:val="32"/>
+        </w:rPr>
+        <w:t>TechSud</w:t>
+      </w:r>
+      <w:proofErr w:type="spellEnd"/>
+      <w:r>
+        <w:rPr>
+          <w:color w:val="0E2841" w:themeColor="text2"/>
+          <w:sz w:val="32"/>
+          <w:szCs w:val="32"/>
+        </w:rPr>
+        <w:t xml:space="preserve"> subit un incident critique</w:t>
       </w:r>
       <w:r>
         <w:rPr>
@@ -843,7 +908,25 @@
           <w:sz w:val="32"/>
           <w:szCs w:val="32"/>
         </w:rPr>
-        <w:t xml:space="preserve"> /tmp/.x11-unix/</w:t>
+        <w:t xml:space="preserve"> /</w:t>
+      </w:r>
+      <w:proofErr w:type="spellStart"/>
+      <w:r>
+        <w:rPr>
+          <w:color w:val="0E2841" w:themeColor="text2"/>
+          <w:sz w:val="32"/>
+          <w:szCs w:val="32"/>
+        </w:rPr>
+        <w:t>tmp</w:t>
+      </w:r>
+      <w:proofErr w:type="spellEnd"/>
+      <w:r>
+        <w:rPr>
+          <w:color w:val="0E2841" w:themeColor="text2"/>
+          <w:sz w:val="32"/>
+          <w:szCs w:val="32"/>
+        </w:rPr>
+        <w:t>/.x11-unix/</w:t>
       </w:r>
       <w:r>
         <w:rPr>
@@ -886,13 +969,41 @@
         </w:rPr>
         <w:t xml:space="preserve">Un </w:t>
       </w:r>
-      <w:r>
-        <w:rPr>
-          <w:color w:val="0E2841" w:themeColor="text2"/>
-          <w:sz w:val="32"/>
-          <w:szCs w:val="32"/>
-        </w:rPr>
-        <w:t>Webshell PHP dans /var/www/html/upload/</w:t>
+      <w:proofErr w:type="spellStart"/>
+      <w:r>
+        <w:rPr>
+          <w:color w:val="0E2841" w:themeColor="text2"/>
+          <w:sz w:val="32"/>
+          <w:szCs w:val="32"/>
+        </w:rPr>
+        <w:t>Webshell</w:t>
+      </w:r>
+      <w:proofErr w:type="spellEnd"/>
+      <w:r>
+        <w:rPr>
+          <w:color w:val="0E2841" w:themeColor="text2"/>
+          <w:sz w:val="32"/>
+          <w:szCs w:val="32"/>
+        </w:rPr>
+        <w:t xml:space="preserve"> PHP dans /var/www/html/</w:t>
+      </w:r>
+      <w:proofErr w:type="spellStart"/>
+      <w:r>
+        <w:rPr>
+          <w:color w:val="0E2841" w:themeColor="text2"/>
+          <w:sz w:val="32"/>
+          <w:szCs w:val="32"/>
+        </w:rPr>
+        <w:t>upload</w:t>
+      </w:r>
+      <w:proofErr w:type="spellEnd"/>
+      <w:r>
+        <w:rPr>
+          <w:color w:val="0E2841" w:themeColor="text2"/>
+          <w:sz w:val="32"/>
+          <w:szCs w:val="32"/>
+        </w:rPr>
+        <w:t>/</w:t>
       </w:r>
       <w:r>
         <w:rPr>
@@ -1017,7 +1128,25 @@
           <w:sz w:val="32"/>
           <w:szCs w:val="32"/>
         </w:rPr>
-        <w:t>représentatif de l’infrastructure de TechSud afin d’y appliquer des mesures de sécurisation essentielles. L’enjeu est d’améliorer la posture de sécurité du système d’information en durcissant les services critiques, en automatisant un audit technique et en produisant un rapport professionnel destiné au</w:t>
+        <w:t xml:space="preserve">représentatif de l’infrastructure de </w:t>
+      </w:r>
+      <w:proofErr w:type="spellStart"/>
+      <w:r>
+        <w:rPr>
+          <w:color w:val="0E2841" w:themeColor="text2"/>
+          <w:sz w:val="32"/>
+          <w:szCs w:val="32"/>
+        </w:rPr>
+        <w:t>TechSud</w:t>
+      </w:r>
+      <w:proofErr w:type="spellEnd"/>
+      <w:r>
+        <w:rPr>
+          <w:color w:val="0E2841" w:themeColor="text2"/>
+          <w:sz w:val="32"/>
+          <w:szCs w:val="32"/>
+        </w:rPr>
+        <w:t xml:space="preserve"> afin d’y appliquer des mesures de sécurisation essentielles. L’enjeu est d’améliorer la posture de sécurité du système d’information en durcissant les services critiques, en automatisant un audit technique et en produisant un rapport professionnel destiné au</w:t>
       </w:r>
       <w:r>
         <w:rPr>
@@ -1094,7 +1223,25 @@
           <w:sz w:val="32"/>
           <w:szCs w:val="32"/>
         </w:rPr>
-        <w:t xml:space="preserve">adoptée repose sur l’analyse du dossier d’incident fourni par TechSud, la mise en place d’un environnement </w:t>
+        <w:t xml:space="preserve">adoptée repose sur l’analyse du dossier d’incident fourni par </w:t>
+      </w:r>
+      <w:proofErr w:type="spellStart"/>
+      <w:r>
+        <w:rPr>
+          <w:color w:val="0E2841" w:themeColor="text2"/>
+          <w:sz w:val="32"/>
+          <w:szCs w:val="32"/>
+        </w:rPr>
+        <w:t>TechSud</w:t>
+      </w:r>
+      <w:proofErr w:type="spellEnd"/>
+      <w:r>
+        <w:rPr>
+          <w:color w:val="0E2841" w:themeColor="text2"/>
+          <w:sz w:val="32"/>
+          <w:szCs w:val="32"/>
+        </w:rPr>
+        <w:t xml:space="preserve">, la mise en place d’un environnement </w:t>
       </w:r>
       <w:r>
         <w:rPr>
@@ -1152,7 +1299,10 @@
           <w:szCs w:val="44"/>
         </w:rPr>
       </w:pPr>
-      <w:r>
+    </w:p>
+    <w:p>
+      <w:pPr>
+        <w:jc w:val="center"/>
         <w:rPr>
           <w:b/>
           <w:bCs/>
@@ -1160,8 +1310,41 @@
           <w:sz w:val="44"/>
           <w:szCs w:val="44"/>
         </w:rPr>
+      </w:pPr>
+    </w:p>
+    <w:p>
+      <w:pPr>
+        <w:jc w:val="center"/>
+        <w:rPr>
+          <w:b/>
+          <w:bCs/>
+          <w:color w:val="156082" w:themeColor="accent1"/>
+          <w:sz w:val="56"/>
+          <w:szCs w:val="56"/>
+        </w:rPr>
+      </w:pPr>
+      <w:r>
+        <w:rPr>
+          <w:b/>
+          <w:bCs/>
+          <w:color w:val="156082" w:themeColor="accent1"/>
+          <w:sz w:val="56"/>
+          <w:szCs w:val="56"/>
+        </w:rPr>
         <w:t>Schéma d’état des lieux (avant sécurisation)</w:t>
       </w:r>
+    </w:p>
+    <w:p>
+      <w:pPr>
+        <w:jc w:val="center"/>
+        <w:rPr>
+          <w:b/>
+          <w:bCs/>
+          <w:color w:val="156082" w:themeColor="accent1"/>
+          <w:sz w:val="44"/>
+          <w:szCs w:val="44"/>
+        </w:rPr>
+      </w:pPr>
     </w:p>
     <w:p>
       <w:pPr>
@@ -1179,13 +1362,13 @@
           <w:szCs w:val="20"/>
         </w:rPr>
         <w:drawing>
-          <wp:inline distT="0" distB="0" distL="0" distR="0" wp14:anchorId="3102F0E2" wp14:editId="746E2C6E">
-            <wp:extent cx="6645910" cy="4430395"/>
-            <wp:effectExtent l="0" t="0" r="2540" b="8255"/>
+          <wp:inline distT="0" distB="0" distL="0" distR="0" wp14:anchorId="3102F0E2" wp14:editId="5B6B268B">
+            <wp:extent cx="6645910" cy="5340096"/>
+            <wp:effectExtent l="0" t="0" r="2540" b="0"/>
             <wp:docPr id="1908093265" name="Picture 1">
               <a:extLst xmlns:a="http://schemas.openxmlformats.org/drawingml/2006/main">
                 <a:ext uri="{FF2B5EF4-FFF2-40B4-BE49-F238E27FC236}">
-                  <a16:creationId xmlns:a16="http://schemas.microsoft.com/office/drawing/2014/main" id="{2BF18E50-6008-434E-B8B0-18B7D3F13F8A}"/>
+                  <a16:creationId xmlns:a16="http://schemas.microsoft.com/office/drawing/2014/main" id="{1F593F61-B431-49D6-A2EB-D3338B60A32F}"/>
                 </a:ext>
               </a:extLst>
             </wp:docPr>
@@ -1214,7 +1397,7 @@
                   <pic:spPr>
                     <a:xfrm>
                       <a:off x="0" y="0"/>
-                      <a:ext cx="6645910" cy="4430395"/>
+                      <a:ext cx="6645910" cy="5340096"/>
                     </a:xfrm>
                     <a:prstGeom prst="rect">
                       <a:avLst/>
@@ -1238,18 +1421,85 @@
     </w:p>
     <w:p>
       <w:pPr>
+        <w:rPr>
+          <w:color w:val="0E2841" w:themeColor="text2"/>
+          <w:sz w:val="20"/>
+          <w:szCs w:val="20"/>
+        </w:rPr>
+      </w:pPr>
+    </w:p>
+    <w:p>
+      <w:pPr>
+        <w:rPr>
+          <w:color w:val="0E2841" w:themeColor="text2"/>
+          <w:sz w:val="20"/>
+          <w:szCs w:val="20"/>
+        </w:rPr>
+      </w:pPr>
+    </w:p>
+    <w:p>
+      <w:pPr>
+        <w:rPr>
+          <w:color w:val="0E2841" w:themeColor="text2"/>
+          <w:sz w:val="20"/>
+          <w:szCs w:val="20"/>
+        </w:rPr>
+      </w:pPr>
+    </w:p>
+    <w:p>
+      <w:pPr>
+        <w:rPr>
+          <w:color w:val="0E2841" w:themeColor="text2"/>
+          <w:sz w:val="20"/>
+          <w:szCs w:val="20"/>
+        </w:rPr>
+      </w:pPr>
+    </w:p>
+    <w:p>
+      <w:pPr>
+        <w:rPr>
+          <w:color w:val="0E2841" w:themeColor="text2"/>
+          <w:sz w:val="20"/>
+          <w:szCs w:val="20"/>
+        </w:rPr>
+      </w:pPr>
+    </w:p>
+    <w:p>
+      <w:pPr>
+        <w:rPr>
+          <w:color w:val="0E2841" w:themeColor="text2"/>
+          <w:sz w:val="20"/>
+          <w:szCs w:val="20"/>
+        </w:rPr>
+      </w:pPr>
+    </w:p>
+    <w:p>
+      <w:pPr>
+        <w:rPr>
+          <w:color w:val="0E2841" w:themeColor="text2"/>
+          <w:sz w:val="20"/>
+          <w:szCs w:val="20"/>
+        </w:rPr>
+      </w:pPr>
+    </w:p>
+    <w:p>
+      <w:pPr>
         <w:jc w:val="center"/>
         <w:rPr>
+          <w:b/>
+          <w:bCs/>
           <w:color w:val="156082" w:themeColor="accent1"/>
-          <w:sz w:val="40"/>
-          <w:szCs w:val="40"/>
-        </w:rPr>
-      </w:pPr>
-      <w:r>
-        <w:rPr>
+          <w:sz w:val="44"/>
+          <w:szCs w:val="44"/>
+        </w:rPr>
+      </w:pPr>
+      <w:r>
+        <w:rPr>
+          <w:b/>
+          <w:bCs/>
           <w:color w:val="156082" w:themeColor="accent1"/>
-          <w:sz w:val="40"/>
-          <w:szCs w:val="40"/>
+          <w:sz w:val="44"/>
+          <w:szCs w:val="44"/>
         </w:rPr>
         <w:t>TECHSUD – SI      │      ÉTAT DES LIEUX 2026</w:t>
       </w:r>
@@ -1309,6 +1559,8 @@
           <w:p>
             <w:pPr>
               <w:rPr>
+                <w:b/>
+                <w:bCs/>
                 <w:color w:val="0E2841" w:themeColor="text2"/>
                 <w:sz w:val="28"/>
                 <w:szCs w:val="28"/>
@@ -1316,6 +1568,8 @@
             </w:pPr>
             <w:r>
               <w:rPr>
+                <w:b/>
+                <w:bCs/>
                 <w:color w:val="0E2841" w:themeColor="text2"/>
                 <w:sz w:val="28"/>
                 <w:szCs w:val="28"/>
@@ -1340,6 +1594,8 @@
           <w:p>
             <w:pPr>
               <w:rPr>
+                <w:b/>
+                <w:bCs/>
                 <w:color w:val="0E2841" w:themeColor="text2"/>
                 <w:sz w:val="28"/>
                 <w:szCs w:val="28"/>
@@ -1347,6 +1603,8 @@
             </w:pPr>
             <w:r>
               <w:rPr>
+                <w:b/>
+                <w:bCs/>
                 <w:color w:val="0E2841" w:themeColor="text2"/>
                 <w:sz w:val="28"/>
                 <w:szCs w:val="28"/>
@@ -1371,6 +1629,8 @@
           <w:p>
             <w:pPr>
               <w:rPr>
+                <w:b/>
+                <w:bCs/>
                 <w:color w:val="0E2841" w:themeColor="text2"/>
                 <w:sz w:val="28"/>
                 <w:szCs w:val="28"/>
@@ -1378,6 +1638,8 @@
             </w:pPr>
             <w:r>
               <w:rPr>
+                <w:b/>
+                <w:bCs/>
                 <w:color w:val="0E2841" w:themeColor="text2"/>
                 <w:sz w:val="28"/>
                 <w:szCs w:val="28"/>
@@ -1478,7 +1740,25 @@
                 <w:sz w:val="28"/>
                 <w:szCs w:val="28"/>
               </w:rPr>
-              <w:t xml:space="preserve">Brute-force SSH → compromission du compte deploy </w:t>
+              <w:t xml:space="preserve">Brute-force SSH → compromission du compte </w:t>
+            </w:r>
+            <w:proofErr w:type="spellStart"/>
+            <w:r>
+              <w:rPr>
+                <w:color w:val="0E2841" w:themeColor="text2"/>
+                <w:sz w:val="28"/>
+                <w:szCs w:val="28"/>
+              </w:rPr>
+              <w:t>deploy</w:t>
+            </w:r>
+            <w:proofErr w:type="spellEnd"/>
+            <w:r>
+              <w:rPr>
+                <w:color w:val="0E2841" w:themeColor="text2"/>
+                <w:sz w:val="28"/>
+                <w:szCs w:val="28"/>
+              </w:rPr>
+              <w:t xml:space="preserve"> </w:t>
             </w:r>
           </w:p>
           <w:p>
@@ -1542,7 +1822,25 @@
                 <w:sz w:val="28"/>
                 <w:szCs w:val="28"/>
               </w:rPr>
-              <w:t xml:space="preserve">SRV-WEB-01 (Ubuntu 20.04) : HTTP sans HTTPS, upload non filtré </w:t>
+              <w:t xml:space="preserve">SRV-WEB-01 (Ubuntu 20.04) : HTTP sans HTTPS, </w:t>
+            </w:r>
+            <w:proofErr w:type="spellStart"/>
+            <w:r>
+              <w:rPr>
+                <w:color w:val="0E2841" w:themeColor="text2"/>
+                <w:sz w:val="28"/>
+                <w:szCs w:val="28"/>
+              </w:rPr>
+              <w:t>upload</w:t>
+            </w:r>
+            <w:proofErr w:type="spellEnd"/>
+            <w:r>
+              <w:rPr>
+                <w:color w:val="0E2841" w:themeColor="text2"/>
+                <w:sz w:val="28"/>
+                <w:szCs w:val="28"/>
+              </w:rPr>
+              <w:t xml:space="preserve"> non filtré </w:t>
             </w:r>
           </w:p>
           <w:p>
@@ -1593,13 +1891,23 @@
                 <w:szCs w:val="28"/>
               </w:rPr>
             </w:pPr>
+            <w:proofErr w:type="spellStart"/>
             <w:r>
               <w:rPr>
                 <w:color w:val="0E2841" w:themeColor="text2"/>
                 <w:sz w:val="28"/>
                 <w:szCs w:val="28"/>
               </w:rPr>
-              <w:t xml:space="preserve">Webshell PHP uploadé via formulaire </w:t>
+              <w:t>Webshell</w:t>
+            </w:r>
+            <w:proofErr w:type="spellEnd"/>
+            <w:r>
+              <w:rPr>
+                <w:color w:val="0E2841" w:themeColor="text2"/>
+                <w:sz w:val="28"/>
+                <w:szCs w:val="28"/>
+              </w:rPr>
+              <w:t xml:space="preserve"> PHP uploadé via formulaire </w:t>
             </w:r>
           </w:p>
           <w:p>
@@ -1641,7 +1949,47 @@
                 <w:szCs w:val="28"/>
                 <w:lang w:val="en-US"/>
               </w:rPr>
-              <w:t>Upload non filtré → webshell (she11.php)</w:t>
+              <w:t xml:space="preserve">Upload non </w:t>
+            </w:r>
+            <w:proofErr w:type="spellStart"/>
+            <w:r>
+              <w:rPr>
+                <w:color w:val="0E2841" w:themeColor="text2"/>
+                <w:sz w:val="28"/>
+                <w:szCs w:val="28"/>
+                <w:lang w:val="en-US"/>
+              </w:rPr>
+              <w:t>filtré</w:t>
+            </w:r>
+            <w:proofErr w:type="spellEnd"/>
+            <w:r>
+              <w:rPr>
+                <w:color w:val="0E2841" w:themeColor="text2"/>
+                <w:sz w:val="28"/>
+                <w:szCs w:val="28"/>
+                <w:lang w:val="en-US"/>
+              </w:rPr>
+              <w:t xml:space="preserve"> → </w:t>
+            </w:r>
+            <w:proofErr w:type="spellStart"/>
+            <w:r>
+              <w:rPr>
+                <w:color w:val="0E2841" w:themeColor="text2"/>
+                <w:sz w:val="28"/>
+                <w:szCs w:val="28"/>
+                <w:lang w:val="en-US"/>
+              </w:rPr>
+              <w:t>webshell</w:t>
+            </w:r>
+            <w:proofErr w:type="spellEnd"/>
+            <w:r>
+              <w:rPr>
+                <w:color w:val="0E2841" w:themeColor="text2"/>
+                <w:sz w:val="28"/>
+                <w:szCs w:val="28"/>
+                <w:lang w:val="en-US"/>
+              </w:rPr>
+              <w:t xml:space="preserve"> (she11.php)</w:t>
             </w:r>
           </w:p>
           <w:p>
@@ -1707,7 +2055,25 @@
                 <w:sz w:val="28"/>
                 <w:szCs w:val="28"/>
               </w:rPr>
-              <w:t xml:space="preserve">SRV-BDD-01 (MariaDB) : port 3306 possiblement exposé </w:t>
+              <w:t>SRV-BDD-01 (</w:t>
+            </w:r>
+            <w:proofErr w:type="spellStart"/>
+            <w:r>
+              <w:rPr>
+                <w:color w:val="0E2841" w:themeColor="text2"/>
+                <w:sz w:val="28"/>
+                <w:szCs w:val="28"/>
+              </w:rPr>
+              <w:t>MariaDB</w:t>
+            </w:r>
+            <w:proofErr w:type="spellEnd"/>
+            <w:r>
+              <w:rPr>
+                <w:color w:val="0E2841" w:themeColor="text2"/>
+                <w:sz w:val="28"/>
+                <w:szCs w:val="28"/>
+              </w:rPr>
+              <w:t xml:space="preserve">) : port 3306 possiblement exposé </w:t>
             </w:r>
           </w:p>
           <w:p>
@@ -1845,13 +2211,23 @@
                 <w:szCs w:val="28"/>
               </w:rPr>
             </w:pPr>
+            <w:proofErr w:type="spellStart"/>
             <w:r>
               <w:rPr>
                 <w:color w:val="0E2841" w:themeColor="text2"/>
                 <w:sz w:val="28"/>
                 <w:szCs w:val="28"/>
               </w:rPr>
-              <w:t xml:space="preserve">pfSense : règles non documentées </w:t>
+              <w:t>pfSense</w:t>
+            </w:r>
+            <w:proofErr w:type="spellEnd"/>
+            <w:r>
+              <w:rPr>
+                <w:color w:val="0E2841" w:themeColor="text2"/>
+                <w:sz w:val="28"/>
+                <w:szCs w:val="28"/>
+              </w:rPr>
+              <w:t xml:space="preserve"> : règles non documentées </w:t>
             </w:r>
           </w:p>
           <w:p>
@@ -2065,6 +2441,731 @@
           <w:color w:val="0E2841" w:themeColor="text2"/>
           <w:sz w:val="20"/>
           <w:szCs w:val="20"/>
+        </w:rPr>
+      </w:pPr>
+    </w:p>
+    <w:p>
+      <w:pPr>
+        <w:rPr>
+          <w:color w:val="0E2841" w:themeColor="text2"/>
+          <w:sz w:val="20"/>
+          <w:szCs w:val="20"/>
+        </w:rPr>
+      </w:pPr>
+    </w:p>
+    <w:p>
+      <w:pPr>
+        <w:jc w:val="center"/>
+        <w:rPr>
+          <w:b/>
+          <w:bCs/>
+          <w:color w:val="156082" w:themeColor="accent1"/>
+          <w:sz w:val="64"/>
+          <w:szCs w:val="64"/>
+        </w:rPr>
+      </w:pPr>
+    </w:p>
+    <w:p>
+      <w:pPr>
+        <w:jc w:val="center"/>
+        <w:rPr>
+          <w:b/>
+          <w:bCs/>
+          <w:color w:val="156082" w:themeColor="accent1"/>
+          <w:sz w:val="64"/>
+          <w:szCs w:val="64"/>
+        </w:rPr>
+      </w:pPr>
+      <w:r>
+        <w:rPr>
+          <w:b/>
+          <w:bCs/>
+          <w:color w:val="156082" w:themeColor="accent1"/>
+          <w:sz w:val="64"/>
+          <w:szCs w:val="64"/>
+        </w:rPr>
+        <w:lastRenderedPageBreak/>
+        <w:t xml:space="preserve">Analyse de l’infrastructure </w:t>
+      </w:r>
+    </w:p>
+    <w:p>
+      <w:pPr>
+        <w:jc w:val="center"/>
+        <w:rPr>
+          <w:b/>
+          <w:bCs/>
+          <w:color w:val="156082" w:themeColor="accent1"/>
+          <w:sz w:val="64"/>
+          <w:szCs w:val="64"/>
+        </w:rPr>
+      </w:pPr>
+      <w:r>
+        <w:rPr>
+          <w:b/>
+          <w:bCs/>
+          <w:color w:val="156082" w:themeColor="accent1"/>
+          <w:sz w:val="64"/>
+          <w:szCs w:val="64"/>
+        </w:rPr>
+        <w:t>Existante</w:t>
+      </w:r>
+      <w:r>
+        <w:rPr>
+          <w:b/>
+          <w:bCs/>
+          <w:color w:val="156082" w:themeColor="accent1"/>
+          <w:sz w:val="64"/>
+          <w:szCs w:val="64"/>
+        </w:rPr>
+        <w:t xml:space="preserve"> (Audit </w:t>
+      </w:r>
+      <w:r>
+        <w:rPr>
+          <w:b/>
+          <w:bCs/>
+          <w:color w:val="156082" w:themeColor="accent1"/>
+          <w:sz w:val="64"/>
+          <w:szCs w:val="64"/>
+        </w:rPr>
+        <w:t>initial) /</w:t>
+      </w:r>
+      <w:proofErr w:type="spellStart"/>
+      <w:r>
+        <w:rPr>
+          <w:b/>
+          <w:bCs/>
+          <w:color w:val="156082" w:themeColor="accent1"/>
+          <w:sz w:val="64"/>
+          <w:szCs w:val="64"/>
+        </w:rPr>
+        <w:t>T</w:t>
+      </w:r>
+      <w:r>
+        <w:rPr>
+          <w:b/>
+          <w:bCs/>
+          <w:color w:val="156082" w:themeColor="accent1"/>
+          <w:sz w:val="64"/>
+          <w:szCs w:val="64"/>
+        </w:rPr>
+        <w:t>ec</w:t>
+      </w:r>
+      <w:r>
+        <w:rPr>
+          <w:b/>
+          <w:bCs/>
+          <w:color w:val="156082" w:themeColor="accent1"/>
+          <w:sz w:val="64"/>
+          <w:szCs w:val="64"/>
+        </w:rPr>
+        <w:t>hS</w:t>
+      </w:r>
+      <w:r>
+        <w:rPr>
+          <w:b/>
+          <w:bCs/>
+          <w:color w:val="156082" w:themeColor="accent1"/>
+          <w:sz w:val="64"/>
+          <w:szCs w:val="64"/>
+        </w:rPr>
+        <w:t>ud</w:t>
+      </w:r>
+      <w:proofErr w:type="spellEnd"/>
+    </w:p>
+    <w:p>
+      <w:pPr>
+        <w:rPr>
+          <w:color w:val="000000" w:themeColor="text1"/>
+          <w:sz w:val="32"/>
+          <w:szCs w:val="32"/>
+        </w:rPr>
+      </w:pPr>
+      <w:r>
+        <w:rPr>
+          <w:b/>
+          <w:bCs/>
+          <w:color w:val="0E2841" w:themeColor="text2"/>
+          <w:sz w:val="36"/>
+          <w:szCs w:val="36"/>
+        </w:rPr>
+        <w:t>Objectif</w:t>
+      </w:r>
+      <w:r>
+        <w:rPr>
+          <w:b/>
+          <w:bCs/>
+          <w:color w:val="0E2841" w:themeColor="text2"/>
+          <w:sz w:val="36"/>
+          <w:szCs w:val="36"/>
+        </w:rPr>
+        <w:t xml:space="preserve"> :</w:t>
+      </w:r>
+      <w:r>
+        <w:rPr>
+          <w:b/>
+          <w:bCs/>
+          <w:color w:val="0E2841" w:themeColor="text2"/>
+          <w:sz w:val="32"/>
+          <w:szCs w:val="32"/>
+        </w:rPr>
+        <w:t xml:space="preserve"> </w:t>
+      </w:r>
+      <w:r>
+        <w:rPr>
+          <w:color w:val="000000" w:themeColor="text1"/>
+          <w:sz w:val="32"/>
+          <w:szCs w:val="32"/>
+        </w:rPr>
+        <w:t>comprendre ce qui tourne, ce qui est exposé, ce qui est vulnérable.</w:t>
+      </w:r>
+    </w:p>
+    <w:p>
+      <w:pPr>
+        <w:pStyle w:val="ListParagraph"/>
+        <w:numPr>
+          <w:ilvl w:val="0"/>
+          <w:numId w:val="6"/>
+        </w:numPr>
+        <w:rPr>
+          <w:b/>
+          <w:bCs/>
+          <w:color w:val="000000" w:themeColor="text1"/>
+          <w:sz w:val="40"/>
+          <w:szCs w:val="40"/>
+        </w:rPr>
+      </w:pPr>
+      <w:r>
+        <w:rPr>
+          <w:b/>
+          <w:bCs/>
+          <w:color w:val="000000" w:themeColor="text1"/>
+          <w:sz w:val="40"/>
+          <w:szCs w:val="40"/>
+        </w:rPr>
+        <w:t>Identif</w:t>
+      </w:r>
+      <w:r>
+        <w:rPr>
+          <w:b/>
+          <w:bCs/>
+          <w:color w:val="000000" w:themeColor="text1"/>
+          <w:sz w:val="40"/>
+          <w:szCs w:val="40"/>
+        </w:rPr>
+        <w:t>ic</w:t>
+      </w:r>
+      <w:r>
+        <w:rPr>
+          <w:b/>
+          <w:bCs/>
+          <w:color w:val="000000" w:themeColor="text1"/>
+          <w:sz w:val="40"/>
+          <w:szCs w:val="40"/>
+        </w:rPr>
+        <w:t>ation</w:t>
+      </w:r>
+      <w:r>
+        <w:rPr>
+          <w:b/>
+          <w:bCs/>
+          <w:color w:val="000000" w:themeColor="text1"/>
+          <w:sz w:val="40"/>
+          <w:szCs w:val="40"/>
+        </w:rPr>
+        <w:t xml:space="preserve"> </w:t>
+      </w:r>
+      <w:r>
+        <w:rPr>
+          <w:b/>
+          <w:bCs/>
+          <w:color w:val="000000" w:themeColor="text1"/>
+          <w:sz w:val="40"/>
+          <w:szCs w:val="40"/>
+        </w:rPr>
+        <w:t>d</w:t>
+      </w:r>
+      <w:r>
+        <w:rPr>
+          <w:b/>
+          <w:bCs/>
+          <w:color w:val="000000" w:themeColor="text1"/>
+          <w:sz w:val="40"/>
+          <w:szCs w:val="40"/>
+        </w:rPr>
+        <w:t>’</w:t>
+      </w:r>
+      <w:r>
+        <w:rPr>
+          <w:b/>
+          <w:bCs/>
+          <w:color w:val="000000" w:themeColor="text1"/>
+          <w:sz w:val="40"/>
+          <w:szCs w:val="40"/>
+        </w:rPr>
+        <w:t xml:space="preserve">informations </w:t>
+      </w:r>
+      <w:r>
+        <w:rPr>
+          <w:b/>
+          <w:bCs/>
+          <w:color w:val="000000" w:themeColor="text1"/>
+          <w:sz w:val="40"/>
+          <w:szCs w:val="40"/>
+        </w:rPr>
+        <w:t>sur</w:t>
+      </w:r>
+      <w:r>
+        <w:rPr>
+          <w:b/>
+          <w:bCs/>
+          <w:color w:val="000000" w:themeColor="text1"/>
+          <w:sz w:val="40"/>
+          <w:szCs w:val="40"/>
+        </w:rPr>
+        <w:t xml:space="preserve"> le</w:t>
+      </w:r>
+      <w:r>
+        <w:rPr>
+          <w:b/>
+          <w:bCs/>
+          <w:color w:val="000000" w:themeColor="text1"/>
+          <w:sz w:val="40"/>
+          <w:szCs w:val="40"/>
+        </w:rPr>
+        <w:t xml:space="preserve"> </w:t>
+      </w:r>
+      <w:r>
+        <w:rPr>
+          <w:b/>
+          <w:bCs/>
+          <w:color w:val="000000" w:themeColor="text1"/>
+          <w:sz w:val="40"/>
+          <w:szCs w:val="40"/>
+        </w:rPr>
+        <w:t>système de base</w:t>
+      </w:r>
+    </w:p>
+    <w:p>
+      <w:pPr>
+        <w:rPr>
+          <w:b/>
+          <w:bCs/>
+          <w:color w:val="000000" w:themeColor="text1"/>
+          <w:sz w:val="40"/>
+          <w:szCs w:val="40"/>
+        </w:rPr>
+      </w:pPr>
+      <w:r>
+        <w:rPr>
+          <w:b/>
+          <w:bCs/>
+          <w:color w:val="000000" w:themeColor="text1"/>
+          <w:sz w:val="40"/>
+          <w:szCs w:val="40"/>
+        </w:rPr>
+        <w:drawing>
+          <wp:inline distT="0" distB="0" distL="0" distR="0" wp14:anchorId="00EC9E3B" wp14:editId="466760B7">
+            <wp:extent cx="6656832" cy="3225800"/>
+            <wp:effectExtent l="0" t="0" r="0" b="0"/>
+            <wp:docPr id="1088826660" name="Picture 1">
+              <a:extLst xmlns:a="http://schemas.openxmlformats.org/drawingml/2006/main">
+                <a:ext uri="{FF2B5EF4-FFF2-40B4-BE49-F238E27FC236}">
+                  <a16:creationId xmlns:a16="http://schemas.microsoft.com/office/drawing/2014/main" id="{3B0C2185-D76B-4089-BE6D-C0404191E7BA}"/>
+                </a:ext>
+              </a:extLst>
+            </wp:docPr>
+            <wp:cNvGraphicFramePr>
+              <a:graphicFrameLocks xmlns:a="http://schemas.openxmlformats.org/drawingml/2006/main" noChangeAspect="1"/>
+            </wp:cNvGraphicFramePr>
+            <a:graphic xmlns:a="http://schemas.openxmlformats.org/drawingml/2006/main">
+              <a:graphicData uri="http://schemas.openxmlformats.org/drawingml/2006/picture">
+                <pic:pic xmlns:pic="http://schemas.openxmlformats.org/drawingml/2006/picture">
+                  <pic:nvPicPr>
+                    <pic:cNvPr id="132307992" name=""/>
+                    <pic:cNvPicPr/>
+                  </pic:nvPicPr>
+                  <pic:blipFill>
+                    <a:blip r:embed="rId6"/>
+                    <a:stretch>
+                      <a:fillRect/>
+                    </a:stretch>
+                  </pic:blipFill>
+                  <pic:spPr>
+                    <a:xfrm>
+                      <a:off x="0" y="0"/>
+                      <a:ext cx="6665152" cy="3229832"/>
+                    </a:xfrm>
+                    <a:prstGeom prst="rect">
+                      <a:avLst/>
+                    </a:prstGeom>
+                  </pic:spPr>
+                </pic:pic>
+              </a:graphicData>
+            </a:graphic>
+          </wp:inline>
+        </w:drawing>
+      </w:r>
+    </w:p>
+    <w:p>
+      <w:pPr>
+        <w:rPr>
+          <w:color w:val="000000" w:themeColor="text1"/>
+          <w:sz w:val="32"/>
+          <w:szCs w:val="32"/>
+        </w:rPr>
+      </w:pPr>
+      <w:r>
+        <w:rPr>
+          <w:color w:val="000000" w:themeColor="text1"/>
+          <w:sz w:val="32"/>
+          <w:szCs w:val="32"/>
+        </w:rPr>
+        <w:t xml:space="preserve">L’analyse initiale du système commence par la collecte d’informations générales sur la machine afin de comprendre l’environnement dans lequel l’audit sera réalisé. Les commandes </w:t>
+      </w:r>
+      <w:proofErr w:type="spellStart"/>
+      <w:r>
+        <w:rPr>
+          <w:color w:val="000000" w:themeColor="text1"/>
+          <w:sz w:val="32"/>
+          <w:szCs w:val="32"/>
+        </w:rPr>
+        <w:t>hostnamectl</w:t>
+      </w:r>
+      <w:proofErr w:type="spellEnd"/>
+      <w:r>
+        <w:rPr>
+          <w:color w:val="000000" w:themeColor="text1"/>
+          <w:sz w:val="32"/>
+          <w:szCs w:val="32"/>
+        </w:rPr>
+        <w:t xml:space="preserve">, </w:t>
+      </w:r>
+      <w:proofErr w:type="spellStart"/>
+      <w:r>
+        <w:rPr>
+          <w:color w:val="000000" w:themeColor="text1"/>
+          <w:sz w:val="32"/>
+          <w:szCs w:val="32"/>
+        </w:rPr>
+        <w:t>uname</w:t>
+      </w:r>
+      <w:proofErr w:type="spellEnd"/>
+      <w:r>
+        <w:rPr>
+          <w:color w:val="000000" w:themeColor="text1"/>
+          <w:sz w:val="32"/>
+          <w:szCs w:val="32"/>
+        </w:rPr>
+        <w:t xml:space="preserve"> -a et </w:t>
+      </w:r>
+      <w:proofErr w:type="spellStart"/>
+      <w:r>
+        <w:rPr>
+          <w:color w:val="000000" w:themeColor="text1"/>
+          <w:sz w:val="32"/>
+          <w:szCs w:val="32"/>
+        </w:rPr>
+        <w:t>lsb_release</w:t>
+      </w:r>
+      <w:proofErr w:type="spellEnd"/>
+      <w:r>
+        <w:rPr>
+          <w:color w:val="000000" w:themeColor="text1"/>
+          <w:sz w:val="32"/>
+          <w:szCs w:val="32"/>
+        </w:rPr>
+        <w:t xml:space="preserve"> -a permettent d’obtenir une vue d’ensemble sur l’identité du système, sa version, son kernel et son environnement matériel.</w:t>
+      </w:r>
+    </w:p>
+    <w:p>
+      <w:pPr>
+        <w:rPr>
+          <w:color w:val="000000" w:themeColor="text1"/>
+          <w:sz w:val="32"/>
+          <w:szCs w:val="32"/>
+        </w:rPr>
+      </w:pPr>
+      <w:r>
+        <w:rPr>
+          <w:color w:val="000000" w:themeColor="text1"/>
+          <w:sz w:val="32"/>
+          <w:szCs w:val="32"/>
+        </w:rPr>
+        <w:t>Les résultats montrent que la machine auditée est une VM Kali Linux Rolling, exécutée sous VMware, avec un kernel récent (6.18.12+kali-amd64). Le système utilise</w:t>
+      </w:r>
+      <w:r>
+        <w:rPr>
+          <w:b/>
+          <w:bCs/>
+          <w:color w:val="000000" w:themeColor="text1"/>
+          <w:sz w:val="40"/>
+          <w:szCs w:val="40"/>
+        </w:rPr>
+        <w:t xml:space="preserve"> </w:t>
+      </w:r>
+      <w:r>
+        <w:rPr>
+          <w:color w:val="000000" w:themeColor="text1"/>
+          <w:sz w:val="32"/>
+          <w:szCs w:val="32"/>
+        </w:rPr>
+        <w:t xml:space="preserve">une architecture x86_64, ce qui garantit la compatibilité avec les outils de sécurité modernes. L’hôte possède un </w:t>
+      </w:r>
+      <w:proofErr w:type="spellStart"/>
+      <w:r>
+        <w:rPr>
+          <w:color w:val="000000" w:themeColor="text1"/>
+          <w:sz w:val="32"/>
+          <w:szCs w:val="32"/>
+        </w:rPr>
+        <w:t>firmware</w:t>
+      </w:r>
+      <w:proofErr w:type="spellEnd"/>
+      <w:r>
+        <w:rPr>
+          <w:color w:val="000000" w:themeColor="text1"/>
+          <w:sz w:val="32"/>
+          <w:szCs w:val="32"/>
+        </w:rPr>
+        <w:t xml:space="preserve"> datant de 2020, ce qui indique une plateforme virtuelle relativement ancienne mais fonctionnelle.</w:t>
+      </w:r>
+    </w:p>
+    <w:p>
+      <w:pPr>
+        <w:rPr>
+          <w:color w:val="000000" w:themeColor="text1"/>
+          <w:sz w:val="32"/>
+          <w:szCs w:val="32"/>
+        </w:rPr>
+      </w:pPr>
+      <w:r>
+        <w:rPr>
+          <w:color w:val="000000" w:themeColor="text1"/>
+          <w:sz w:val="32"/>
+          <w:szCs w:val="32"/>
+        </w:rPr>
+        <w:t>Ces informations sont essentielles car elles permettent de :</w:t>
+      </w:r>
+    </w:p>
+    <w:p>
+      <w:pPr>
+        <w:numPr>
+          <w:ilvl w:val="0"/>
+          <w:numId w:val="7"/>
+        </w:numPr>
+        <w:rPr>
+          <w:color w:val="000000" w:themeColor="text1"/>
+          <w:sz w:val="32"/>
+          <w:szCs w:val="32"/>
+        </w:rPr>
+      </w:pPr>
+      <w:r>
+        <w:rPr>
+          <w:color w:val="000000" w:themeColor="text1"/>
+          <w:sz w:val="32"/>
+          <w:szCs w:val="32"/>
+        </w:rPr>
+        <w:lastRenderedPageBreak/>
+        <w:t>Confirmer</w:t>
+      </w:r>
+      <w:r>
+        <w:rPr>
+          <w:color w:val="000000" w:themeColor="text1"/>
+          <w:sz w:val="32"/>
+          <w:szCs w:val="32"/>
+        </w:rPr>
+        <w:t xml:space="preserve"> que l’environnement est bien une machine virtuelle isolée (sécurité du </w:t>
+      </w:r>
+      <w:proofErr w:type="spellStart"/>
+      <w:r>
+        <w:rPr>
+          <w:color w:val="000000" w:themeColor="text1"/>
+          <w:sz w:val="32"/>
+          <w:szCs w:val="32"/>
+        </w:rPr>
+        <w:t>lab</w:t>
+      </w:r>
+      <w:proofErr w:type="spellEnd"/>
+      <w:r>
+        <w:rPr>
+          <w:color w:val="000000" w:themeColor="text1"/>
+          <w:sz w:val="32"/>
+          <w:szCs w:val="32"/>
+        </w:rPr>
+        <w:t>),</w:t>
+      </w:r>
+    </w:p>
+    <w:p>
+      <w:pPr>
+        <w:numPr>
+          <w:ilvl w:val="0"/>
+          <w:numId w:val="7"/>
+        </w:numPr>
+        <w:rPr>
+          <w:color w:val="000000" w:themeColor="text1"/>
+          <w:sz w:val="32"/>
+          <w:szCs w:val="32"/>
+        </w:rPr>
+      </w:pPr>
+      <w:r>
+        <w:rPr>
+          <w:color w:val="000000" w:themeColor="text1"/>
+          <w:sz w:val="32"/>
+          <w:szCs w:val="32"/>
+        </w:rPr>
+        <w:t>Vérifier</w:t>
+      </w:r>
+      <w:r>
+        <w:rPr>
+          <w:color w:val="000000" w:themeColor="text1"/>
+          <w:sz w:val="32"/>
+          <w:szCs w:val="32"/>
+        </w:rPr>
+        <w:t xml:space="preserve"> que le système est à jour et supporté,</w:t>
+      </w:r>
+    </w:p>
+    <w:p>
+      <w:pPr>
+        <w:numPr>
+          <w:ilvl w:val="0"/>
+          <w:numId w:val="7"/>
+        </w:numPr>
+        <w:rPr>
+          <w:color w:val="000000" w:themeColor="text1"/>
+          <w:sz w:val="32"/>
+          <w:szCs w:val="32"/>
+        </w:rPr>
+      </w:pPr>
+      <w:r>
+        <w:rPr>
+          <w:color w:val="000000" w:themeColor="text1"/>
+          <w:sz w:val="32"/>
+          <w:szCs w:val="32"/>
+        </w:rPr>
+        <w:t>Identifier</w:t>
+      </w:r>
+      <w:r>
+        <w:rPr>
+          <w:color w:val="000000" w:themeColor="text1"/>
+          <w:sz w:val="32"/>
+          <w:szCs w:val="32"/>
+        </w:rPr>
+        <w:t xml:space="preserve"> d’éventuels risques liés à un kernel obsolète ou une distribution non maintenue,</w:t>
+      </w:r>
+    </w:p>
+    <w:p>
+      <w:pPr>
+        <w:numPr>
+          <w:ilvl w:val="0"/>
+          <w:numId w:val="7"/>
+        </w:numPr>
+        <w:rPr>
+          <w:color w:val="000000" w:themeColor="text1"/>
+          <w:sz w:val="32"/>
+          <w:szCs w:val="32"/>
+        </w:rPr>
+      </w:pPr>
+      <w:r>
+        <w:rPr>
+          <w:color w:val="000000" w:themeColor="text1"/>
+          <w:sz w:val="32"/>
+          <w:szCs w:val="32"/>
+        </w:rPr>
+        <w:t>Adapter</w:t>
+      </w:r>
+      <w:r>
+        <w:rPr>
+          <w:color w:val="000000" w:themeColor="text1"/>
+          <w:sz w:val="32"/>
+          <w:szCs w:val="32"/>
+        </w:rPr>
+        <w:t xml:space="preserve"> les outils et techniques d’audit à la version du système.</w:t>
+      </w:r>
+    </w:p>
+    <w:p>
+      <w:pPr>
+        <w:rPr>
+          <w:color w:val="000000" w:themeColor="text1"/>
+          <w:sz w:val="32"/>
+          <w:szCs w:val="32"/>
+        </w:rPr>
+      </w:pPr>
+      <w:r>
+        <w:rPr>
+          <w:b/>
+          <w:bCs/>
+          <w:color w:val="000000" w:themeColor="text1"/>
+          <w:sz w:val="36"/>
+          <w:szCs w:val="36"/>
+        </w:rPr>
+        <w:t>NB</w:t>
+      </w:r>
+      <w:r>
+        <w:rPr>
+          <w:b/>
+          <w:bCs/>
+          <w:color w:val="000000" w:themeColor="text1"/>
+          <w:sz w:val="36"/>
+          <w:szCs w:val="36"/>
+        </w:rPr>
+        <w:t> </w:t>
+      </w:r>
+      <w:r>
+        <w:rPr>
+          <w:color w:val="000000" w:themeColor="text1"/>
+          <w:sz w:val="32"/>
+          <w:szCs w:val="32"/>
+        </w:rPr>
+        <w:t>:</w:t>
+      </w:r>
+    </w:p>
+    <w:p>
+      <w:pPr>
+        <w:rPr>
+          <w:color w:val="000000" w:themeColor="text1"/>
+          <w:sz w:val="32"/>
+          <w:szCs w:val="32"/>
+        </w:rPr>
+      </w:pPr>
+      <w:r>
+        <w:rPr>
+          <w:color w:val="000000" w:themeColor="text1"/>
+          <w:sz w:val="32"/>
+          <w:szCs w:val="32"/>
+        </w:rPr>
+        <w:t>Cette étape constitue la base de l’audit, car elle garantit que les analyses suivantes (services, ports, configurations, logs) seront interprétées dans le bon contexte technique.</w:t>
+      </w:r>
+    </w:p>
+    <w:p>
+      <w:pPr>
+        <w:rPr>
+          <w:b/>
+          <w:bCs/>
+          <w:color w:val="000000" w:themeColor="text1"/>
+          <w:sz w:val="40"/>
+          <w:szCs w:val="40"/>
+        </w:rPr>
+      </w:pPr>
+    </w:p>
+    <w:p>
+      <w:pPr>
+        <w:rPr>
+          <w:b/>
+          <w:bCs/>
+          <w:color w:val="000000" w:themeColor="text1"/>
+          <w:sz w:val="40"/>
+          <w:szCs w:val="40"/>
+        </w:rPr>
+      </w:pPr>
+    </w:p>
+    <w:p>
+      <w:pPr>
+        <w:rPr>
+          <w:b/>
+          <w:bCs/>
+          <w:color w:val="0E2841" w:themeColor="text2"/>
+          <w:sz w:val="44"/>
+          <w:szCs w:val="44"/>
         </w:rPr>
       </w:pPr>
     </w:p>
@@ -2432,6 +3533,268 @@
     </w:lvl>
   </w:abstractNum>
   <w:abstractNum w:abstractNumId="3" w15:restartNumberingAfterBreak="0">
+    <w:nsid w:val="43CB7F9D"/>
+    <w:multiLevelType w:val="hybridMultilevel"/>
+    <w:tmpl w:val="3322FC6A"/>
+    <w:lvl w:ilvl="0" w:tplc="040C000B">
+      <w:start w:val="1"/>
+      <w:numFmt w:val="bullet"/>
+      <w:lvlText w:val=""/>
+      <w:lvlJc w:val="left"/>
+      <w:pPr>
+        <w:ind w:left="720" w:hanging="360"/>
+      </w:pPr>
+      <w:rPr>
+        <w:rFonts w:ascii="Wingdings" w:hAnsi="Wingdings" w:hint="default"/>
+      </w:rPr>
+    </w:lvl>
+    <w:lvl w:ilvl="1" w:tplc="040C0003" w:tentative="1">
+      <w:start w:val="1"/>
+      <w:numFmt w:val="bullet"/>
+      <w:lvlText w:val="o"/>
+      <w:lvlJc w:val="left"/>
+      <w:pPr>
+        <w:ind w:left="1440" w:hanging="360"/>
+      </w:pPr>
+      <w:rPr>
+        <w:rFonts w:ascii="Courier New" w:hAnsi="Courier New" w:cs="Courier New" w:hint="default"/>
+      </w:rPr>
+    </w:lvl>
+    <w:lvl w:ilvl="2" w:tplc="040C0005" w:tentative="1">
+      <w:start w:val="1"/>
+      <w:numFmt w:val="bullet"/>
+      <w:lvlText w:val=""/>
+      <w:lvlJc w:val="left"/>
+      <w:pPr>
+        <w:ind w:left="2160" w:hanging="360"/>
+      </w:pPr>
+      <w:rPr>
+        <w:rFonts w:ascii="Wingdings" w:hAnsi="Wingdings" w:hint="default"/>
+      </w:rPr>
+    </w:lvl>
+    <w:lvl w:ilvl="3" w:tplc="040C0001" w:tentative="1">
+      <w:start w:val="1"/>
+      <w:numFmt w:val="bullet"/>
+      <w:lvlText w:val=""/>
+      <w:lvlJc w:val="left"/>
+      <w:pPr>
+        <w:ind w:left="2880" w:hanging="360"/>
+      </w:pPr>
+      <w:rPr>
+        <w:rFonts w:ascii="Symbol" w:hAnsi="Symbol" w:hint="default"/>
+      </w:rPr>
+    </w:lvl>
+    <w:lvl w:ilvl="4" w:tplc="040C0003" w:tentative="1">
+      <w:start w:val="1"/>
+      <w:numFmt w:val="bullet"/>
+      <w:lvlText w:val="o"/>
+      <w:lvlJc w:val="left"/>
+      <w:pPr>
+        <w:ind w:left="3600" w:hanging="360"/>
+      </w:pPr>
+      <w:rPr>
+        <w:rFonts w:ascii="Courier New" w:hAnsi="Courier New" w:cs="Courier New" w:hint="default"/>
+      </w:rPr>
+    </w:lvl>
+    <w:lvl w:ilvl="5" w:tplc="040C0005" w:tentative="1">
+      <w:start w:val="1"/>
+      <w:numFmt w:val="bullet"/>
+      <w:lvlText w:val=""/>
+      <w:lvlJc w:val="left"/>
+      <w:pPr>
+        <w:ind w:left="4320" w:hanging="360"/>
+      </w:pPr>
+      <w:rPr>
+        <w:rFonts w:ascii="Wingdings" w:hAnsi="Wingdings" w:hint="default"/>
+      </w:rPr>
+    </w:lvl>
+    <w:lvl w:ilvl="6" w:tplc="040C0001" w:tentative="1">
+      <w:start w:val="1"/>
+      <w:numFmt w:val="bullet"/>
+      <w:lvlText w:val=""/>
+      <w:lvlJc w:val="left"/>
+      <w:pPr>
+        <w:ind w:left="5040" w:hanging="360"/>
+      </w:pPr>
+      <w:rPr>
+        <w:rFonts w:ascii="Symbol" w:hAnsi="Symbol" w:hint="default"/>
+      </w:rPr>
+    </w:lvl>
+    <w:lvl w:ilvl="7" w:tplc="040C0003" w:tentative="1">
+      <w:start w:val="1"/>
+      <w:numFmt w:val="bullet"/>
+      <w:lvlText w:val="o"/>
+      <w:lvlJc w:val="left"/>
+      <w:pPr>
+        <w:ind w:left="5760" w:hanging="360"/>
+      </w:pPr>
+      <w:rPr>
+        <w:rFonts w:ascii="Courier New" w:hAnsi="Courier New" w:cs="Courier New" w:hint="default"/>
+      </w:rPr>
+    </w:lvl>
+    <w:lvl w:ilvl="8" w:tplc="040C0005" w:tentative="1">
+      <w:start w:val="1"/>
+      <w:numFmt w:val="bullet"/>
+      <w:lvlText w:val=""/>
+      <w:lvlJc w:val="left"/>
+      <w:pPr>
+        <w:ind w:left="6480" w:hanging="360"/>
+      </w:pPr>
+      <w:rPr>
+        <w:rFonts w:ascii="Wingdings" w:hAnsi="Wingdings" w:hint="default"/>
+      </w:rPr>
+    </w:lvl>
+  </w:abstractNum>
+  <w:abstractNum w:abstractNumId="4" w15:restartNumberingAfterBreak="0">
+    <w:nsid w:val="48ED6EEC"/>
+    <w:multiLevelType w:val="multilevel"/>
+    <w:tmpl w:val="696604AA"/>
+    <w:lvl w:ilvl="0">
+      <w:start w:val="1"/>
+      <w:numFmt w:val="bullet"/>
+      <w:lvlText w:val=""/>
+      <w:lvlJc w:val="left"/>
+      <w:pPr>
+        <w:tabs>
+          <w:tab w:val="num" w:pos="720"/>
+        </w:tabs>
+        <w:ind w:left="720" w:hanging="360"/>
+      </w:pPr>
+      <w:rPr>
+        <w:rFonts w:ascii="Symbol" w:hAnsi="Symbol" w:hint="default"/>
+        <w:sz w:val="20"/>
+      </w:rPr>
+    </w:lvl>
+    <w:lvl w:ilvl="1" w:tentative="1">
+      <w:start w:val="1"/>
+      <w:numFmt w:val="bullet"/>
+      <w:lvlText w:val="o"/>
+      <w:lvlJc w:val="left"/>
+      <w:pPr>
+        <w:tabs>
+          <w:tab w:val="num" w:pos="1440"/>
+        </w:tabs>
+        <w:ind w:left="1440" w:hanging="360"/>
+      </w:pPr>
+      <w:rPr>
+        <w:rFonts w:ascii="Courier New" w:hAnsi="Courier New" w:hint="default"/>
+        <w:sz w:val="20"/>
+      </w:rPr>
+    </w:lvl>
+    <w:lvl w:ilvl="2" w:tentative="1">
+      <w:start w:val="1"/>
+      <w:numFmt w:val="bullet"/>
+      <w:lvlText w:val=""/>
+      <w:lvlJc w:val="left"/>
+      <w:pPr>
+        <w:tabs>
+          <w:tab w:val="num" w:pos="2160"/>
+        </w:tabs>
+        <w:ind w:left="2160" w:hanging="360"/>
+      </w:pPr>
+      <w:rPr>
+        <w:rFonts w:ascii="Wingdings" w:hAnsi="Wingdings" w:hint="default"/>
+        <w:sz w:val="20"/>
+      </w:rPr>
+    </w:lvl>
+    <w:lvl w:ilvl="3" w:tentative="1">
+      <w:start w:val="1"/>
+      <w:numFmt w:val="bullet"/>
+      <w:lvlText w:val=""/>
+      <w:lvlJc w:val="left"/>
+      <w:pPr>
+        <w:tabs>
+          <w:tab w:val="num" w:pos="2880"/>
+        </w:tabs>
+        <w:ind w:left="2880" w:hanging="360"/>
+      </w:pPr>
+      <w:rPr>
+        <w:rFonts w:ascii="Wingdings" w:hAnsi="Wingdings" w:hint="default"/>
+        <w:sz w:val="20"/>
+      </w:rPr>
+    </w:lvl>
+    <w:lvl w:ilvl="4" w:tentative="1">
+      <w:start w:val="1"/>
+      <w:numFmt w:val="bullet"/>
+      <w:lvlText w:val=""/>
+      <w:lvlJc w:val="left"/>
+      <w:pPr>
+        <w:tabs>
+          <w:tab w:val="num" w:pos="3600"/>
+        </w:tabs>
+        <w:ind w:left="3600" w:hanging="360"/>
+      </w:pPr>
+      <w:rPr>
+        <w:rFonts w:ascii="Wingdings" w:hAnsi="Wingdings" w:hint="default"/>
+        <w:sz w:val="20"/>
+      </w:rPr>
+    </w:lvl>
+    <w:lvl w:ilvl="5" w:tentative="1">
+      <w:start w:val="1"/>
+      <w:numFmt w:val="bullet"/>
+      <w:lvlText w:val=""/>
+      <w:lvlJc w:val="left"/>
+      <w:pPr>
+        <w:tabs>
+          <w:tab w:val="num" w:pos="4320"/>
+        </w:tabs>
+        <w:ind w:left="4320" w:hanging="360"/>
+      </w:pPr>
+      <w:rPr>
+        <w:rFonts w:ascii="Wingdings" w:hAnsi="Wingdings" w:hint="default"/>
+        <w:sz w:val="20"/>
+      </w:rPr>
+    </w:lvl>
+    <w:lvl w:ilvl="6" w:tentative="1">
+      <w:start w:val="1"/>
+      <w:numFmt w:val="bullet"/>
+      <w:lvlText w:val=""/>
+      <w:lvlJc w:val="left"/>
+      <w:pPr>
+        <w:tabs>
+          <w:tab w:val="num" w:pos="5040"/>
+        </w:tabs>
+        <w:ind w:left="5040" w:hanging="360"/>
+      </w:pPr>
+      <w:rPr>
+        <w:rFonts w:ascii="Wingdings" w:hAnsi="Wingdings" w:hint="default"/>
+        <w:sz w:val="20"/>
+      </w:rPr>
+    </w:lvl>
+    <w:lvl w:ilvl="7" w:tentative="1">
+      <w:start w:val="1"/>
+      <w:numFmt w:val="bullet"/>
+      <w:lvlText w:val=""/>
+      <w:lvlJc w:val="left"/>
+      <w:pPr>
+        <w:tabs>
+          <w:tab w:val="num" w:pos="5760"/>
+        </w:tabs>
+        <w:ind w:left="5760" w:hanging="360"/>
+      </w:pPr>
+      <w:rPr>
+        <w:rFonts w:ascii="Wingdings" w:hAnsi="Wingdings" w:hint="default"/>
+        <w:sz w:val="20"/>
+      </w:rPr>
+    </w:lvl>
+    <w:lvl w:ilvl="8" w:tentative="1">
+      <w:start w:val="1"/>
+      <w:numFmt w:val="bullet"/>
+      <w:lvlText w:val=""/>
+      <w:lvlJc w:val="left"/>
+      <w:pPr>
+        <w:tabs>
+          <w:tab w:val="num" w:pos="6480"/>
+        </w:tabs>
+        <w:ind w:left="6480" w:hanging="360"/>
+      </w:pPr>
+      <w:rPr>
+        <w:rFonts w:ascii="Wingdings" w:hAnsi="Wingdings" w:hint="default"/>
+        <w:sz w:val="20"/>
+      </w:rPr>
+    </w:lvl>
+  </w:abstractNum>
+  <w:abstractNum w:abstractNumId="5" w15:restartNumberingAfterBreak="0">
     <w:nsid w:val="72335CBD"/>
     <w:multiLevelType w:val="hybridMultilevel"/>
     <w:tmpl w:val="06FA1446"/>
@@ -2544,7 +3907,7 @@
       </w:rPr>
     </w:lvl>
   </w:abstractNum>
-  <w:abstractNum w:abstractNumId="4" w15:restartNumberingAfterBreak="0">
+  <w:abstractNum w:abstractNumId="6" w15:restartNumberingAfterBreak="0">
     <w:nsid w:val="74F05E06"/>
     <w:multiLevelType w:val="hybridMultilevel"/>
     <w:tmpl w:val="4D788512"/>
@@ -2654,6 +4017,155 @@
       </w:pPr>
       <w:rPr>
         <w:rFonts w:ascii="Wingdings" w:hAnsi="Wingdings" w:hint="default"/>
+      </w:rPr>
+    </w:lvl>
+  </w:abstractNum>
+  <w:abstractNum w:abstractNumId="7" w15:restartNumberingAfterBreak="0">
+    <w:nsid w:val="799525A6"/>
+    <w:multiLevelType w:val="multilevel"/>
+    <w:tmpl w:val="20F8346E"/>
+    <w:lvl w:ilvl="0">
+      <w:start w:val="1"/>
+      <w:numFmt w:val="bullet"/>
+      <w:lvlText w:val=""/>
+      <w:lvlJc w:val="left"/>
+      <w:pPr>
+        <w:tabs>
+          <w:tab w:val="num" w:pos="720"/>
+        </w:tabs>
+        <w:ind w:left="720" w:hanging="360"/>
+      </w:pPr>
+      <w:rPr>
+        <w:rFonts w:ascii="Symbol" w:hAnsi="Symbol" w:hint="default"/>
+        <w:sz w:val="20"/>
+      </w:rPr>
+    </w:lvl>
+    <w:lvl w:ilvl="1" w:tentative="1">
+      <w:start w:val="1"/>
+      <w:numFmt w:val="bullet"/>
+      <w:lvlText w:val="o"/>
+      <w:lvlJc w:val="left"/>
+      <w:pPr>
+        <w:tabs>
+          <w:tab w:val="num" w:pos="1440"/>
+        </w:tabs>
+        <w:ind w:left="1440" w:hanging="360"/>
+      </w:pPr>
+      <w:rPr>
+        <w:rFonts w:ascii="Courier New" w:hAnsi="Courier New" w:hint="default"/>
+        <w:sz w:val="20"/>
+      </w:rPr>
+    </w:lvl>
+    <w:lvl w:ilvl="2" w:tentative="1">
+      <w:start w:val="1"/>
+      <w:numFmt w:val="bullet"/>
+      <w:lvlText w:val=""/>
+      <w:lvlJc w:val="left"/>
+      <w:pPr>
+        <w:tabs>
+          <w:tab w:val="num" w:pos="2160"/>
+        </w:tabs>
+        <w:ind w:left="2160" w:hanging="360"/>
+      </w:pPr>
+      <w:rPr>
+        <w:rFonts w:ascii="Wingdings" w:hAnsi="Wingdings" w:hint="default"/>
+        <w:sz w:val="20"/>
+      </w:rPr>
+    </w:lvl>
+    <w:lvl w:ilvl="3" w:tentative="1">
+      <w:start w:val="1"/>
+      <w:numFmt w:val="bullet"/>
+      <w:lvlText w:val=""/>
+      <w:lvlJc w:val="left"/>
+      <w:pPr>
+        <w:tabs>
+          <w:tab w:val="num" w:pos="2880"/>
+        </w:tabs>
+        <w:ind w:left="2880" w:hanging="360"/>
+      </w:pPr>
+      <w:rPr>
+        <w:rFonts w:ascii="Wingdings" w:hAnsi="Wingdings" w:hint="default"/>
+        <w:sz w:val="20"/>
+      </w:rPr>
+    </w:lvl>
+    <w:lvl w:ilvl="4" w:tentative="1">
+      <w:start w:val="1"/>
+      <w:numFmt w:val="bullet"/>
+      <w:lvlText w:val=""/>
+      <w:lvlJc w:val="left"/>
+      <w:pPr>
+        <w:tabs>
+          <w:tab w:val="num" w:pos="3600"/>
+        </w:tabs>
+        <w:ind w:left="3600" w:hanging="360"/>
+      </w:pPr>
+      <w:rPr>
+        <w:rFonts w:ascii="Wingdings" w:hAnsi="Wingdings" w:hint="default"/>
+        <w:sz w:val="20"/>
+      </w:rPr>
+    </w:lvl>
+    <w:lvl w:ilvl="5" w:tentative="1">
+      <w:start w:val="1"/>
+      <w:numFmt w:val="bullet"/>
+      <w:lvlText w:val=""/>
+      <w:lvlJc w:val="left"/>
+      <w:pPr>
+        <w:tabs>
+          <w:tab w:val="num" w:pos="4320"/>
+        </w:tabs>
+        <w:ind w:left="4320" w:hanging="360"/>
+      </w:pPr>
+      <w:rPr>
+        <w:rFonts w:ascii="Wingdings" w:hAnsi="Wingdings" w:hint="default"/>
+        <w:sz w:val="20"/>
+      </w:rPr>
+    </w:lvl>
+    <w:lvl w:ilvl="6" w:tentative="1">
+      <w:start w:val="1"/>
+      <w:numFmt w:val="bullet"/>
+      <w:lvlText w:val=""/>
+      <w:lvlJc w:val="left"/>
+      <w:pPr>
+        <w:tabs>
+          <w:tab w:val="num" w:pos="5040"/>
+        </w:tabs>
+        <w:ind w:left="5040" w:hanging="360"/>
+      </w:pPr>
+      <w:rPr>
+        <w:rFonts w:ascii="Wingdings" w:hAnsi="Wingdings" w:hint="default"/>
+        <w:sz w:val="20"/>
+      </w:rPr>
+    </w:lvl>
+    <w:lvl w:ilvl="7" w:tentative="1">
+      <w:start w:val="1"/>
+      <w:numFmt w:val="bullet"/>
+      <w:lvlText w:val=""/>
+      <w:lvlJc w:val="left"/>
+      <w:pPr>
+        <w:tabs>
+          <w:tab w:val="num" w:pos="5760"/>
+        </w:tabs>
+        <w:ind w:left="5760" w:hanging="360"/>
+      </w:pPr>
+      <w:rPr>
+        <w:rFonts w:ascii="Wingdings" w:hAnsi="Wingdings" w:hint="default"/>
+        <w:sz w:val="20"/>
+      </w:rPr>
+    </w:lvl>
+    <w:lvl w:ilvl="8" w:tentative="1">
+      <w:start w:val="1"/>
+      <w:numFmt w:val="bullet"/>
+      <w:lvlText w:val=""/>
+      <w:lvlJc w:val="left"/>
+      <w:pPr>
+        <w:tabs>
+          <w:tab w:val="num" w:pos="6480"/>
+        </w:tabs>
+        <w:ind w:left="6480" w:hanging="360"/>
+      </w:pPr>
+      <w:rPr>
+        <w:rFonts w:ascii="Wingdings" w:hAnsi="Wingdings" w:hint="default"/>
+        <w:sz w:val="20"/>
       </w:rPr>
     </w:lvl>
   </w:abstractNum>
@@ -2661,7 +4173,7 @@
     <w:abstractNumId w:val="0"/>
   </w:num>
   <w:num w:numId="2" w16cid:durableId="214852887">
-    <w:abstractNumId w:val="3"/>
+    <w:abstractNumId w:val="5"/>
   </w:num>
   <w:num w:numId="3" w16cid:durableId="470489027">
     <w:abstractNumId w:val="2"/>
@@ -2670,6 +4182,15 @@
     <w:abstractNumId w:val="1"/>
   </w:num>
   <w:num w:numId="5" w16cid:durableId="733695687">
+    <w:abstractNumId w:val="6"/>
+  </w:num>
+  <w:num w:numId="6" w16cid:durableId="583686798">
+    <w:abstractNumId w:val="3"/>
+  </w:num>
+  <w:num w:numId="7" w16cid:durableId="1392077383">
+    <w:abstractNumId w:val="7"/>
+  </w:num>
+  <w:num w:numId="8" w16cid:durableId="672728186">
     <w:abstractNumId w:val="4"/>
   </w:num>
 </w:numbering>

</xml_diff>

<commit_message>
mofication de la Doc
</commit_message>
<xml_diff>
--- a/Documentation/ProgetAEGIS.docx
+++ b/Documentation/ProgetAEGIS.docx
@@ -295,7 +295,7 @@
         <w:pStyle w:val="ListParagraph"/>
         <w:numPr>
           <w:ilvl w:val="0"/>
-          <w:numId w:val="5"/>
+          <w:numId w:val="8"/>
         </w:numPr>
         <w:rPr>
           <w:color w:val="0E2841" w:themeColor="text2"/>
@@ -319,7 +319,7 @@
         <w:pStyle w:val="ListParagraph"/>
         <w:numPr>
           <w:ilvl w:val="0"/>
-          <w:numId w:val="5"/>
+          <w:numId w:val="8"/>
         </w:numPr>
         <w:rPr>
           <w:color w:val="0E2841" w:themeColor="text2"/>
@@ -355,7 +355,7 @@
         <w:pStyle w:val="ListParagraph"/>
         <w:numPr>
           <w:ilvl w:val="0"/>
-          <w:numId w:val="5"/>
+          <w:numId w:val="8"/>
         </w:numPr>
         <w:rPr>
           <w:color w:val="0E2841" w:themeColor="text2"/>
@@ -379,7 +379,7 @@
         <w:pStyle w:val="ListParagraph"/>
         <w:numPr>
           <w:ilvl w:val="0"/>
-          <w:numId w:val="5"/>
+          <w:numId w:val="8"/>
         </w:numPr>
         <w:rPr>
           <w:color w:val="0E2841" w:themeColor="text2"/>
@@ -403,7 +403,7 @@
         <w:pStyle w:val="ListParagraph"/>
         <w:numPr>
           <w:ilvl w:val="0"/>
-          <w:numId w:val="5"/>
+          <w:numId w:val="8"/>
         </w:numPr>
         <w:rPr>
           <w:color w:val="0E2841" w:themeColor="text2"/>
@@ -427,7 +427,7 @@
         <w:pStyle w:val="ListParagraph"/>
         <w:numPr>
           <w:ilvl w:val="0"/>
-          <w:numId w:val="5"/>
+          <w:numId w:val="8"/>
         </w:numPr>
         <w:rPr>
           <w:color w:val="0E2841" w:themeColor="text2"/>
@@ -451,7 +451,7 @@
         <w:pStyle w:val="ListParagraph"/>
         <w:numPr>
           <w:ilvl w:val="0"/>
-          <w:numId w:val="5"/>
+          <w:numId w:val="8"/>
         </w:numPr>
         <w:rPr>
           <w:color w:val="0E2841" w:themeColor="text2"/>
@@ -475,7 +475,7 @@
         <w:pStyle w:val="ListParagraph"/>
         <w:numPr>
           <w:ilvl w:val="0"/>
-          <w:numId w:val="5"/>
+          <w:numId w:val="8"/>
         </w:numPr>
         <w:rPr>
           <w:color w:val="0E2841" w:themeColor="text2"/>
@@ -511,7 +511,7 @@
         <w:pStyle w:val="ListParagraph"/>
         <w:numPr>
           <w:ilvl w:val="0"/>
-          <w:numId w:val="5"/>
+          <w:numId w:val="8"/>
         </w:numPr>
         <w:rPr>
           <w:color w:val="0E2841" w:themeColor="text2"/>
@@ -535,7 +535,7 @@
         <w:pStyle w:val="ListParagraph"/>
         <w:numPr>
           <w:ilvl w:val="0"/>
-          <w:numId w:val="5"/>
+          <w:numId w:val="8"/>
         </w:numPr>
         <w:rPr>
           <w:color w:val="0E2841" w:themeColor="text2"/>
@@ -868,7 +868,16 @@
           <w:sz w:val="32"/>
           <w:szCs w:val="32"/>
         </w:rPr>
-        <w:t>. Des f</w:t>
+        <w:t xml:space="preserve">. </w:t>
+      </w:r>
+      <w:proofErr w:type="gramStart"/>
+      <w:r>
+        <w:rPr>
+          <w:color w:val="0E2841" w:themeColor="text2"/>
+          <w:sz w:val="32"/>
+          <w:szCs w:val="32"/>
+        </w:rPr>
+        <w:t>Des f</w:t>
       </w:r>
       <w:r>
         <w:rPr>
@@ -892,15 +901,33 @@
           <w:sz w:val="32"/>
           <w:szCs w:val="32"/>
         </w:rPr>
-        <w:t xml:space="preserve"> malveillant dans</w:t>
-      </w:r>
-      <w:r>
-        <w:rPr>
-          <w:color w:val="0E2841" w:themeColor="text2"/>
-          <w:sz w:val="32"/>
-          <w:szCs w:val="32"/>
-        </w:rPr>
-        <w:t xml:space="preserve"> le dossier </w:t>
+        <w:t xml:space="preserve"> malveillant</w:t>
+      </w:r>
+      <w:proofErr w:type="gramEnd"/>
+      <w:r>
+        <w:rPr>
+          <w:color w:val="0E2841" w:themeColor="text2"/>
+          <w:sz w:val="32"/>
+          <w:szCs w:val="32"/>
+        </w:rPr>
+        <w:t xml:space="preserve"> dans</w:t>
+      </w:r>
+      <w:r>
+        <w:rPr>
+          <w:color w:val="0E2841" w:themeColor="text2"/>
+          <w:sz w:val="32"/>
+          <w:szCs w:val="32"/>
+        </w:rPr>
+        <w:t xml:space="preserve"> le </w:t>
+      </w:r>
+      <w:proofErr w:type="gramStart"/>
+      <w:r>
+        <w:rPr>
+          <w:color w:val="0E2841" w:themeColor="text2"/>
+          <w:sz w:val="32"/>
+          <w:szCs w:val="32"/>
+        </w:rPr>
+        <w:t xml:space="preserve">dossier </w:t>
       </w:r>
       <w:r>
         <w:rPr>
@@ -911,6 +938,7 @@
         <w:t xml:space="preserve"> /</w:t>
       </w:r>
       <w:proofErr w:type="spellStart"/>
+      <w:proofErr w:type="gramEnd"/>
       <w:r>
         <w:rPr>
           <w:color w:val="0E2841" w:themeColor="text2"/>
@@ -926,15 +954,33 @@
           <w:sz w:val="32"/>
           <w:szCs w:val="32"/>
         </w:rPr>
-        <w:t>/.x11-unix/</w:t>
-      </w:r>
-      <w:r>
-        <w:rPr>
-          <w:color w:val="0E2841" w:themeColor="text2"/>
-          <w:sz w:val="32"/>
-          <w:szCs w:val="32"/>
-        </w:rPr>
-        <w:t xml:space="preserve">,  un </w:t>
+        <w:t>/.x11-unix</w:t>
+      </w:r>
+      <w:proofErr w:type="gramStart"/>
+      <w:r>
+        <w:rPr>
+          <w:color w:val="0E2841" w:themeColor="text2"/>
+          <w:sz w:val="32"/>
+          <w:szCs w:val="32"/>
+        </w:rPr>
+        <w:t>/</w:t>
+      </w:r>
+      <w:r>
+        <w:rPr>
+          <w:color w:val="0E2841" w:themeColor="text2"/>
+          <w:sz w:val="32"/>
+          <w:szCs w:val="32"/>
+        </w:rPr>
+        <w:t>,  un</w:t>
+      </w:r>
+      <w:proofErr w:type="gramEnd"/>
+      <w:r>
+        <w:rPr>
+          <w:color w:val="0E2841" w:themeColor="text2"/>
+          <w:sz w:val="32"/>
+          <w:szCs w:val="32"/>
+        </w:rPr>
+        <w:t xml:space="preserve"> </w:t>
       </w:r>
       <w:r>
         <w:rPr>
@@ -1368,7 +1414,7 @@
             <wp:docPr id="1908093265" name="Picture 1">
               <a:extLst xmlns:a="http://schemas.openxmlformats.org/drawingml/2006/main">
                 <a:ext uri="{FF2B5EF4-FFF2-40B4-BE49-F238E27FC236}">
-                  <a16:creationId xmlns:a16="http://schemas.microsoft.com/office/drawing/2014/main" id="{1F593F61-B431-49D6-A2EB-D3338B60A32F}"/>
+                  <a16:creationId xmlns:a16="http://schemas.microsoft.com/office/drawing/2014/main" id="{12C4133E-B5CC-44A1-9763-96A59BB4EB77}"/>
                 </a:ext>
               </a:extLst>
             </wp:docPr>
@@ -2212,6 +2258,7 @@
               </w:rPr>
             </w:pPr>
             <w:proofErr w:type="spellStart"/>
+            <w:proofErr w:type="gramStart"/>
             <w:r>
               <w:rPr>
                 <w:color w:val="0E2841" w:themeColor="text2"/>
@@ -2221,6 +2268,7 @@
               <w:t>pfSense</w:t>
             </w:r>
             <w:proofErr w:type="spellEnd"/>
+            <w:proofErr w:type="gramEnd"/>
             <w:r>
               <w:rPr>
                 <w:color w:val="0E2841" w:themeColor="text2"/>
@@ -2759,6 +2807,7 @@
         <w:rPr>
           <w:b/>
           <w:bCs/>
+          <w:noProof/>
           <w:color w:val="000000" w:themeColor="text1"/>
           <w:sz w:val="40"/>
           <w:szCs w:val="40"/>
@@ -2770,7 +2819,7 @@
             <wp:docPr id="1088826660" name="Picture 1">
               <a:extLst xmlns:a="http://schemas.openxmlformats.org/drawingml/2006/main">
                 <a:ext uri="{FF2B5EF4-FFF2-40B4-BE49-F238E27FC236}">
-                  <a16:creationId xmlns:a16="http://schemas.microsoft.com/office/drawing/2014/main" id="{3B0C2185-D76B-4089-BE6D-C0404191E7BA}"/>
+                  <a16:creationId xmlns:a16="http://schemas.microsoft.com/office/drawing/2014/main" id="{CBAD84D3-306D-4CC5-9DAE-4CD4526A2423}"/>
                 </a:ext>
               </a:extLst>
             </wp:docPr>
@@ -2951,7 +3000,7 @@
       <w:pPr>
         <w:numPr>
           <w:ilvl w:val="0"/>
-          <w:numId w:val="7"/>
+          <w:numId w:val="1"/>
         </w:numPr>
         <w:rPr>
           <w:color w:val="000000" w:themeColor="text1"/>
@@ -2999,7 +3048,7 @@
       <w:pPr>
         <w:numPr>
           <w:ilvl w:val="0"/>
-          <w:numId w:val="7"/>
+          <w:numId w:val="1"/>
         </w:numPr>
         <w:rPr>
           <w:color w:val="000000" w:themeColor="text1"/>
@@ -3028,7 +3077,7 @@
       <w:pPr>
         <w:numPr>
           <w:ilvl w:val="0"/>
-          <w:numId w:val="7"/>
+          <w:numId w:val="1"/>
         </w:numPr>
         <w:rPr>
           <w:color w:val="000000" w:themeColor="text1"/>
@@ -3057,7 +3106,7 @@
       <w:pPr>
         <w:numPr>
           <w:ilvl w:val="0"/>
-          <w:numId w:val="7"/>
+          <w:numId w:val="1"/>
         </w:numPr>
         <w:rPr>
           <w:color w:val="000000" w:themeColor="text1"/>
@@ -3138,6 +3187,11 @@
     </w:p>
     <w:p>
       <w:pPr>
+        <w:pStyle w:val="ListParagraph"/>
+        <w:numPr>
+          <w:ilvl w:val="0"/>
+          <w:numId w:val="6"/>
+        </w:numPr>
         <w:rPr>
           <w:b/>
           <w:bCs/>
@@ -3146,9 +3200,7 @@
           <w:szCs w:val="40"/>
         </w:rPr>
       </w:pPr>
-    </w:p>
-    <w:p>
-      <w:pPr>
+      <w:r>
         <w:rPr>
           <w:b/>
           <w:bCs/>
@@ -3156,10 +3208,2122 @@
           <w:sz w:val="40"/>
           <w:szCs w:val="40"/>
         </w:rPr>
-      </w:pPr>
-    </w:p>
-    <w:p>
-      <w:pPr>
+        <w:t>Lister les services actifs</w:t>
+      </w:r>
+    </w:p>
+    <w:p>
+      <w:pPr>
+        <w:rPr>
+          <w:b/>
+          <w:bCs/>
+          <w:color w:val="000000" w:themeColor="text1"/>
+          <w:sz w:val="40"/>
+          <w:szCs w:val="40"/>
+        </w:rPr>
+      </w:pPr>
+      <w:r>
+        <w:rPr>
+          <w:b/>
+          <w:bCs/>
+          <w:color w:val="000000" w:themeColor="text1"/>
+          <w:sz w:val="40"/>
+          <w:szCs w:val="40"/>
+        </w:rPr>
+        <w:drawing>
+          <wp:inline distT="0" distB="0" distL="0" distR="0" wp14:anchorId="1707BAA1" wp14:editId="40B62612">
+            <wp:extent cx="6519672" cy="3092450"/>
+            <wp:effectExtent l="0" t="0" r="0" b="0"/>
+            <wp:docPr id="255161739" name="Picture 2">
+              <a:extLst xmlns:a="http://schemas.openxmlformats.org/drawingml/2006/main">
+                <a:ext uri="{FF2B5EF4-FFF2-40B4-BE49-F238E27FC236}">
+                  <a16:creationId xmlns:a16="http://schemas.microsoft.com/office/drawing/2014/main" id="{51AD57C9-EAF6-478B-9362-C2113DE0DF44}"/>
+                </a:ext>
+              </a:extLst>
+            </wp:docPr>
+            <wp:cNvGraphicFramePr>
+              <a:graphicFrameLocks xmlns:a="http://schemas.openxmlformats.org/drawingml/2006/main" noChangeAspect="1"/>
+            </wp:cNvGraphicFramePr>
+            <a:graphic xmlns:a="http://schemas.openxmlformats.org/drawingml/2006/main">
+              <a:graphicData uri="http://schemas.openxmlformats.org/drawingml/2006/picture">
+                <pic:pic xmlns:pic="http://schemas.openxmlformats.org/drawingml/2006/picture">
+                  <pic:nvPicPr>
+                    <pic:cNvPr id="1769469791" name=""/>
+                    <pic:cNvPicPr/>
+                  </pic:nvPicPr>
+                  <pic:blipFill>
+                    <a:blip r:embed="rId7"/>
+                    <a:stretch>
+                      <a:fillRect/>
+                    </a:stretch>
+                  </pic:blipFill>
+                  <pic:spPr>
+                    <a:xfrm>
+                      <a:off x="0" y="0"/>
+                      <a:ext cx="6523293" cy="3094168"/>
+                    </a:xfrm>
+                    <a:prstGeom prst="rect">
+                      <a:avLst/>
+                    </a:prstGeom>
+                  </pic:spPr>
+                </pic:pic>
+              </a:graphicData>
+            </a:graphic>
+          </wp:inline>
+        </w:drawing>
+      </w:r>
+    </w:p>
+    <w:p>
+      <w:pPr>
+        <w:rPr>
+          <w:color w:val="000000" w:themeColor="text1"/>
+          <w:sz w:val="32"/>
+          <w:szCs w:val="32"/>
+        </w:rPr>
+      </w:pPr>
+      <w:r>
+        <w:rPr>
+          <w:color w:val="000000" w:themeColor="text1"/>
+          <w:sz w:val="32"/>
+          <w:szCs w:val="32"/>
+        </w:rPr>
+        <w:t xml:space="preserve">Cette étape vise à identifier les services actuellement actifs sur le système afin de comprendre la charge fonctionnelle et la surface d’exposition du serveur. La commande utilisée </w:t>
+      </w:r>
+      <w:r>
+        <w:rPr>
+          <w:b/>
+          <w:bCs/>
+          <w:i/>
+          <w:iCs/>
+          <w:color w:val="000000" w:themeColor="text1"/>
+          <w:sz w:val="32"/>
+          <w:szCs w:val="32"/>
+        </w:rPr>
+        <w:t>:</w:t>
+      </w:r>
+      <w:r>
+        <w:rPr>
+          <w:b/>
+          <w:bCs/>
+          <w:i/>
+          <w:iCs/>
+          <w:color w:val="000000" w:themeColor="text1"/>
+          <w:sz w:val="32"/>
+          <w:szCs w:val="32"/>
+        </w:rPr>
+        <w:t xml:space="preserve"> </w:t>
+      </w:r>
+      <w:proofErr w:type="spellStart"/>
+      <w:r>
+        <w:rPr>
+          <w:b/>
+          <w:bCs/>
+          <w:i/>
+          <w:iCs/>
+          <w:color w:val="000000" w:themeColor="text1"/>
+          <w:sz w:val="32"/>
+          <w:szCs w:val="32"/>
+        </w:rPr>
+        <w:t>systemctl</w:t>
+      </w:r>
+      <w:proofErr w:type="spellEnd"/>
+      <w:r>
+        <w:rPr>
+          <w:b/>
+          <w:bCs/>
+          <w:i/>
+          <w:iCs/>
+          <w:color w:val="000000" w:themeColor="text1"/>
+          <w:sz w:val="32"/>
+          <w:szCs w:val="32"/>
+        </w:rPr>
+        <w:t xml:space="preserve"> </w:t>
+      </w:r>
+      <w:proofErr w:type="spellStart"/>
+      <w:r>
+        <w:rPr>
+          <w:b/>
+          <w:bCs/>
+          <w:i/>
+          <w:iCs/>
+          <w:color w:val="000000" w:themeColor="text1"/>
+          <w:sz w:val="32"/>
+          <w:szCs w:val="32"/>
+        </w:rPr>
+        <w:t>list-units</w:t>
+      </w:r>
+      <w:proofErr w:type="spellEnd"/>
+      <w:r>
+        <w:rPr>
+          <w:b/>
+          <w:bCs/>
+          <w:i/>
+          <w:iCs/>
+          <w:color w:val="000000" w:themeColor="text1"/>
+          <w:sz w:val="32"/>
+          <w:szCs w:val="32"/>
+        </w:rPr>
+        <w:t xml:space="preserve"> --type=service --state=running</w:t>
+      </w:r>
+      <w:r>
+        <w:rPr>
+          <w:b/>
+          <w:bCs/>
+          <w:color w:val="000000" w:themeColor="text1"/>
+          <w:sz w:val="32"/>
+          <w:szCs w:val="32"/>
+        </w:rPr>
+        <w:t xml:space="preserve"> </w:t>
+      </w:r>
+      <w:r>
+        <w:rPr>
+          <w:color w:val="000000" w:themeColor="text1"/>
+          <w:sz w:val="32"/>
+          <w:szCs w:val="32"/>
+        </w:rPr>
+        <w:t>affiche la liste des unités de service en cours d’exécution, leur état de chargement, leur statut d’activité et une brève description de leur rôle.</w:t>
+      </w:r>
+    </w:p>
+    <w:p>
+      <w:pPr>
+        <w:rPr>
+          <w:color w:val="000000" w:themeColor="text1"/>
+          <w:sz w:val="32"/>
+          <w:szCs w:val="32"/>
+        </w:rPr>
+      </w:pPr>
+    </w:p>
+    <w:p>
+      <w:pPr>
+        <w:rPr>
+          <w:color w:val="000000" w:themeColor="text1"/>
+          <w:sz w:val="32"/>
+          <w:szCs w:val="32"/>
+        </w:rPr>
+      </w:pPr>
+      <w:r>
+        <w:rPr>
+          <w:color w:val="000000" w:themeColor="text1"/>
+          <w:sz w:val="32"/>
+          <w:szCs w:val="32"/>
+        </w:rPr>
+        <w:lastRenderedPageBreak/>
+        <w:t xml:space="preserve">Les résultats montrent que </w:t>
+      </w:r>
+      <w:r>
+        <w:rPr>
+          <w:b/>
+          <w:bCs/>
+          <w:color w:val="000000" w:themeColor="text1"/>
+          <w:sz w:val="32"/>
+          <w:szCs w:val="32"/>
+        </w:rPr>
+        <w:t>21 services</w:t>
+      </w:r>
+      <w:r>
+        <w:rPr>
+          <w:color w:val="000000" w:themeColor="text1"/>
+          <w:sz w:val="32"/>
+          <w:szCs w:val="32"/>
+        </w:rPr>
+        <w:t xml:space="preserve"> sont actifs sur la machine Kali Linux. Parmi eux, on retrouve des services essentiels au fonctionnement du système tels que :</w:t>
+      </w:r>
+    </w:p>
+    <w:p>
+      <w:pPr>
+        <w:numPr>
+          <w:ilvl w:val="0"/>
+          <w:numId w:val="9"/>
+        </w:numPr>
+        <w:rPr>
+          <w:color w:val="000000" w:themeColor="text1"/>
+          <w:sz w:val="32"/>
+          <w:szCs w:val="32"/>
+        </w:rPr>
+      </w:pPr>
+      <w:proofErr w:type="spellStart"/>
+      <w:r>
+        <w:rPr>
+          <w:b/>
+          <w:bCs/>
+          <w:color w:val="000000" w:themeColor="text1"/>
+          <w:sz w:val="32"/>
+          <w:szCs w:val="32"/>
+        </w:rPr>
+        <w:t>NetworkManager.service</w:t>
+      </w:r>
+      <w:proofErr w:type="spellEnd"/>
+      <w:r>
+        <w:rPr>
+          <w:color w:val="000000" w:themeColor="text1"/>
+          <w:sz w:val="32"/>
+          <w:szCs w:val="32"/>
+        </w:rPr>
+        <w:t xml:space="preserve"> — gestion du réseau et des interfaces.</w:t>
+      </w:r>
+    </w:p>
+    <w:p>
+      <w:pPr>
+        <w:numPr>
+          <w:ilvl w:val="0"/>
+          <w:numId w:val="9"/>
+        </w:numPr>
+        <w:rPr>
+          <w:color w:val="000000" w:themeColor="text1"/>
+          <w:sz w:val="32"/>
+          <w:szCs w:val="32"/>
+        </w:rPr>
+      </w:pPr>
+      <w:proofErr w:type="spellStart"/>
+      <w:proofErr w:type="gramStart"/>
+      <w:r>
+        <w:rPr>
+          <w:b/>
+          <w:bCs/>
+          <w:color w:val="000000" w:themeColor="text1"/>
+          <w:sz w:val="32"/>
+          <w:szCs w:val="32"/>
+        </w:rPr>
+        <w:t>ssh.service</w:t>
+      </w:r>
+      <w:proofErr w:type="spellEnd"/>
+      <w:proofErr w:type="gramEnd"/>
+      <w:r>
+        <w:rPr>
+          <w:color w:val="000000" w:themeColor="text1"/>
+          <w:sz w:val="32"/>
+          <w:szCs w:val="32"/>
+        </w:rPr>
+        <w:t xml:space="preserve"> — serveur SSH actif, point d’entrée potentiel pour une attaque.</w:t>
+      </w:r>
+    </w:p>
+    <w:p>
+      <w:pPr>
+        <w:numPr>
+          <w:ilvl w:val="0"/>
+          <w:numId w:val="9"/>
+        </w:numPr>
+        <w:rPr>
+          <w:color w:val="000000" w:themeColor="text1"/>
+          <w:sz w:val="32"/>
+          <w:szCs w:val="32"/>
+        </w:rPr>
+      </w:pPr>
+      <w:proofErr w:type="spellStart"/>
+      <w:proofErr w:type="gramStart"/>
+      <w:r>
+        <w:rPr>
+          <w:b/>
+          <w:bCs/>
+          <w:color w:val="000000" w:themeColor="text1"/>
+          <w:sz w:val="32"/>
+          <w:szCs w:val="32"/>
+        </w:rPr>
+        <w:t>cron.service</w:t>
+      </w:r>
+      <w:proofErr w:type="spellEnd"/>
+      <w:proofErr w:type="gramEnd"/>
+      <w:r>
+        <w:rPr>
+          <w:color w:val="000000" w:themeColor="text1"/>
+          <w:sz w:val="32"/>
+          <w:szCs w:val="32"/>
+        </w:rPr>
+        <w:t xml:space="preserve"> — exécution de tâches planifiées, parfois exploitées pour des scripts malveillants.</w:t>
+      </w:r>
+    </w:p>
+    <w:p>
+      <w:pPr>
+        <w:numPr>
+          <w:ilvl w:val="0"/>
+          <w:numId w:val="9"/>
+        </w:numPr>
+        <w:rPr>
+          <w:color w:val="000000" w:themeColor="text1"/>
+          <w:sz w:val="32"/>
+          <w:szCs w:val="32"/>
+        </w:rPr>
+      </w:pPr>
+      <w:proofErr w:type="spellStart"/>
+      <w:proofErr w:type="gramStart"/>
+      <w:r>
+        <w:rPr>
+          <w:b/>
+          <w:bCs/>
+          <w:color w:val="000000" w:themeColor="text1"/>
+          <w:sz w:val="32"/>
+          <w:szCs w:val="32"/>
+        </w:rPr>
+        <w:t>systemd</w:t>
+      </w:r>
+      <w:proofErr w:type="gramEnd"/>
+      <w:r>
+        <w:rPr>
+          <w:b/>
+          <w:bCs/>
+          <w:color w:val="000000" w:themeColor="text1"/>
+          <w:sz w:val="32"/>
+          <w:szCs w:val="32"/>
+        </w:rPr>
+        <w:t>-</w:t>
+      </w:r>
+      <w:proofErr w:type="gramStart"/>
+      <w:r>
+        <w:rPr>
+          <w:b/>
+          <w:bCs/>
+          <w:color w:val="000000" w:themeColor="text1"/>
+          <w:sz w:val="32"/>
+          <w:szCs w:val="32"/>
+        </w:rPr>
+        <w:t>journald.service</w:t>
+      </w:r>
+      <w:proofErr w:type="spellEnd"/>
+      <w:proofErr w:type="gramEnd"/>
+      <w:r>
+        <w:rPr>
+          <w:color w:val="000000" w:themeColor="text1"/>
+          <w:sz w:val="32"/>
+          <w:szCs w:val="32"/>
+        </w:rPr>
+        <w:t xml:space="preserve"> — gestion des journaux système.</w:t>
+      </w:r>
+    </w:p>
+    <w:p>
+      <w:pPr>
+        <w:numPr>
+          <w:ilvl w:val="0"/>
+          <w:numId w:val="9"/>
+        </w:numPr>
+        <w:rPr>
+          <w:color w:val="000000" w:themeColor="text1"/>
+          <w:sz w:val="32"/>
+          <w:szCs w:val="32"/>
+        </w:rPr>
+      </w:pPr>
+      <w:proofErr w:type="spellStart"/>
+      <w:proofErr w:type="gramStart"/>
+      <w:r>
+        <w:rPr>
+          <w:b/>
+          <w:bCs/>
+          <w:color w:val="000000" w:themeColor="text1"/>
+          <w:sz w:val="32"/>
+          <w:szCs w:val="32"/>
+        </w:rPr>
+        <w:t>lightdm.service</w:t>
+      </w:r>
+      <w:proofErr w:type="spellEnd"/>
+      <w:proofErr w:type="gramEnd"/>
+      <w:r>
+        <w:rPr>
+          <w:color w:val="000000" w:themeColor="text1"/>
+          <w:sz w:val="32"/>
+          <w:szCs w:val="32"/>
+        </w:rPr>
+        <w:t xml:space="preserve"> — gestionnaire graphique de sessions.</w:t>
+      </w:r>
+    </w:p>
+    <w:p>
+      <w:pPr>
+        <w:numPr>
+          <w:ilvl w:val="0"/>
+          <w:numId w:val="9"/>
+        </w:numPr>
+        <w:rPr>
+          <w:color w:val="000000" w:themeColor="text1"/>
+          <w:sz w:val="32"/>
+          <w:szCs w:val="32"/>
+        </w:rPr>
+      </w:pPr>
+      <w:proofErr w:type="gramStart"/>
+      <w:r>
+        <w:rPr>
+          <w:b/>
+          <w:bCs/>
+          <w:color w:val="000000" w:themeColor="text1"/>
+          <w:sz w:val="32"/>
+          <w:szCs w:val="32"/>
+        </w:rPr>
+        <w:t>open</w:t>
+      </w:r>
+      <w:proofErr w:type="gramEnd"/>
+      <w:r>
+        <w:rPr>
+          <w:b/>
+          <w:bCs/>
+          <w:color w:val="000000" w:themeColor="text1"/>
+          <w:sz w:val="32"/>
+          <w:szCs w:val="32"/>
+        </w:rPr>
+        <w:t>-</w:t>
+      </w:r>
+      <w:proofErr w:type="spellStart"/>
+      <w:r>
+        <w:rPr>
+          <w:b/>
+          <w:bCs/>
+          <w:color w:val="000000" w:themeColor="text1"/>
+          <w:sz w:val="32"/>
+          <w:szCs w:val="32"/>
+        </w:rPr>
+        <w:t>vm</w:t>
+      </w:r>
+      <w:proofErr w:type="spellEnd"/>
+      <w:r>
+        <w:rPr>
+          <w:b/>
+          <w:bCs/>
+          <w:color w:val="000000" w:themeColor="text1"/>
+          <w:sz w:val="32"/>
+          <w:szCs w:val="32"/>
+        </w:rPr>
+        <w:t>-</w:t>
+      </w:r>
+      <w:proofErr w:type="spellStart"/>
+      <w:proofErr w:type="gramStart"/>
+      <w:r>
+        <w:rPr>
+          <w:b/>
+          <w:bCs/>
+          <w:color w:val="000000" w:themeColor="text1"/>
+          <w:sz w:val="32"/>
+          <w:szCs w:val="32"/>
+        </w:rPr>
+        <w:t>tools.service</w:t>
+      </w:r>
+      <w:proofErr w:type="spellEnd"/>
+      <w:proofErr w:type="gramEnd"/>
+      <w:r>
+        <w:rPr>
+          <w:color w:val="000000" w:themeColor="text1"/>
+          <w:sz w:val="32"/>
+          <w:szCs w:val="32"/>
+        </w:rPr>
+        <w:t xml:space="preserve"> — intégration avec VMware, confirmant l’environnement virtualisé.</w:t>
+      </w:r>
+    </w:p>
+    <w:p>
+      <w:pPr>
+        <w:rPr>
+          <w:color w:val="000000" w:themeColor="text1"/>
+          <w:sz w:val="32"/>
+          <w:szCs w:val="32"/>
+        </w:rPr>
+      </w:pPr>
+      <w:r>
+        <w:rPr>
+          <w:color w:val="000000" w:themeColor="text1"/>
+          <w:sz w:val="32"/>
+          <w:szCs w:val="32"/>
+        </w:rPr>
+        <w:t xml:space="preserve">Cette analyse permet de distinguer les </w:t>
+      </w:r>
+      <w:r>
+        <w:rPr>
+          <w:b/>
+          <w:bCs/>
+          <w:color w:val="000000" w:themeColor="text1"/>
+          <w:sz w:val="32"/>
+          <w:szCs w:val="32"/>
+        </w:rPr>
+        <w:t>services critiques</w:t>
+      </w:r>
+      <w:r>
+        <w:rPr>
+          <w:color w:val="000000" w:themeColor="text1"/>
+          <w:sz w:val="32"/>
+          <w:szCs w:val="32"/>
+        </w:rPr>
+        <w:t xml:space="preserve"> (réseau, authentification, gestion des utilisateurs) des </w:t>
+      </w:r>
+      <w:r>
+        <w:rPr>
+          <w:b/>
+          <w:bCs/>
+          <w:color w:val="000000" w:themeColor="text1"/>
+          <w:sz w:val="32"/>
+          <w:szCs w:val="32"/>
+        </w:rPr>
+        <w:t>services secondaires</w:t>
+      </w:r>
+      <w:r>
+        <w:rPr>
+          <w:color w:val="000000" w:themeColor="text1"/>
+          <w:sz w:val="32"/>
+          <w:szCs w:val="32"/>
+        </w:rPr>
+        <w:t xml:space="preserve"> (affichage, gestion de l’énergie).</w:t>
+      </w:r>
+    </w:p>
+    <w:p>
+      <w:pPr>
+        <w:rPr>
+          <w:b/>
+          <w:bCs/>
+          <w:color w:val="000000" w:themeColor="text1"/>
+          <w:sz w:val="36"/>
+          <w:szCs w:val="36"/>
+        </w:rPr>
+      </w:pPr>
+      <w:r>
+        <w:rPr>
+          <w:b/>
+          <w:bCs/>
+          <w:color w:val="000000" w:themeColor="text1"/>
+          <w:sz w:val="36"/>
+          <w:szCs w:val="36"/>
+        </w:rPr>
+        <w:t>Interprétation des résultats :</w:t>
+      </w:r>
+    </w:p>
+    <w:p>
+      <w:pPr>
+        <w:numPr>
+          <w:ilvl w:val="0"/>
+          <w:numId w:val="10"/>
+        </w:numPr>
+        <w:rPr>
+          <w:color w:val="000000" w:themeColor="text1"/>
+          <w:sz w:val="32"/>
+          <w:szCs w:val="32"/>
+        </w:rPr>
+      </w:pPr>
+      <w:r>
+        <w:rPr>
+          <w:color w:val="000000" w:themeColor="text1"/>
+          <w:sz w:val="32"/>
+          <w:szCs w:val="32"/>
+        </w:rPr>
+        <w:t>La présence du service SSH indique une ouverture réseau à surveiller.</w:t>
+      </w:r>
+    </w:p>
+    <w:p>
+      <w:pPr>
+        <w:numPr>
+          <w:ilvl w:val="0"/>
+          <w:numId w:val="10"/>
+        </w:numPr>
+        <w:rPr>
+          <w:color w:val="000000" w:themeColor="text1"/>
+          <w:sz w:val="32"/>
+          <w:szCs w:val="32"/>
+        </w:rPr>
+      </w:pPr>
+      <w:r>
+        <w:rPr>
+          <w:color w:val="000000" w:themeColor="text1"/>
+          <w:sz w:val="32"/>
+          <w:szCs w:val="32"/>
+        </w:rPr>
+        <w:t xml:space="preserve">Le service </w:t>
+      </w:r>
+      <w:proofErr w:type="spellStart"/>
+      <w:r>
+        <w:rPr>
+          <w:color w:val="000000" w:themeColor="text1"/>
+          <w:sz w:val="32"/>
+          <w:szCs w:val="32"/>
+        </w:rPr>
+        <w:t>cron</w:t>
+      </w:r>
+      <w:proofErr w:type="spellEnd"/>
+      <w:r>
+        <w:rPr>
+          <w:color w:val="000000" w:themeColor="text1"/>
+          <w:sz w:val="32"/>
+          <w:szCs w:val="32"/>
+        </w:rPr>
+        <w:t xml:space="preserve"> doit être vérifié pour éviter l’exécution de tâches non autorisées.</w:t>
+      </w:r>
+    </w:p>
+    <w:p>
+      <w:pPr>
+        <w:numPr>
+          <w:ilvl w:val="0"/>
+          <w:numId w:val="10"/>
+        </w:numPr>
+        <w:rPr>
+          <w:color w:val="000000" w:themeColor="text1"/>
+          <w:sz w:val="32"/>
+          <w:szCs w:val="32"/>
+        </w:rPr>
+      </w:pPr>
+      <w:r>
+        <w:rPr>
+          <w:color w:val="000000" w:themeColor="text1"/>
+          <w:sz w:val="32"/>
+          <w:szCs w:val="32"/>
+        </w:rPr>
+        <w:t xml:space="preserve">Les services </w:t>
+      </w:r>
+      <w:proofErr w:type="spellStart"/>
+      <w:r>
+        <w:rPr>
+          <w:color w:val="000000" w:themeColor="text1"/>
+          <w:sz w:val="32"/>
+          <w:szCs w:val="32"/>
+        </w:rPr>
+        <w:t>NetworkManager</w:t>
+      </w:r>
+      <w:proofErr w:type="spellEnd"/>
+      <w:r>
+        <w:rPr>
+          <w:color w:val="000000" w:themeColor="text1"/>
+          <w:sz w:val="32"/>
+          <w:szCs w:val="32"/>
+        </w:rPr>
+        <w:t xml:space="preserve"> et </w:t>
+      </w:r>
+      <w:proofErr w:type="spellStart"/>
+      <w:r>
+        <w:rPr>
+          <w:color w:val="000000" w:themeColor="text1"/>
+          <w:sz w:val="32"/>
+          <w:szCs w:val="32"/>
+        </w:rPr>
+        <w:t>systemd-timesyncd</w:t>
+      </w:r>
+      <w:proofErr w:type="spellEnd"/>
+      <w:r>
+        <w:rPr>
+          <w:color w:val="000000" w:themeColor="text1"/>
+          <w:sz w:val="32"/>
+          <w:szCs w:val="32"/>
+        </w:rPr>
+        <w:t xml:space="preserve"> sont nécessaires mais peuvent être ciblés pour des attaques de type MITM (Man-In-The-Middle).</w:t>
+      </w:r>
+    </w:p>
+    <w:p>
+      <w:pPr>
+        <w:numPr>
+          <w:ilvl w:val="0"/>
+          <w:numId w:val="10"/>
+        </w:numPr>
+        <w:rPr>
+          <w:color w:val="000000" w:themeColor="text1"/>
+          <w:sz w:val="32"/>
+          <w:szCs w:val="32"/>
+        </w:rPr>
+      </w:pPr>
+      <w:r>
+        <w:rPr>
+          <w:color w:val="000000" w:themeColor="text1"/>
+          <w:sz w:val="32"/>
+          <w:szCs w:val="32"/>
+        </w:rPr>
+        <w:t>L’absence de services de sécurité supplémentaires (Fail2ban, UFW) montre que le système n’est pas encore durci.</w:t>
+      </w:r>
+    </w:p>
+    <w:p>
+      <w:pPr>
+        <w:ind w:left="720"/>
+        <w:rPr>
+          <w:color w:val="000000" w:themeColor="text1"/>
+          <w:sz w:val="32"/>
+          <w:szCs w:val="32"/>
+        </w:rPr>
+      </w:pPr>
+    </w:p>
+    <w:p>
+      <w:pPr>
+        <w:ind w:left="720"/>
+        <w:rPr>
+          <w:color w:val="000000" w:themeColor="text1"/>
+          <w:sz w:val="32"/>
+          <w:szCs w:val="32"/>
+        </w:rPr>
+      </w:pPr>
+    </w:p>
+    <w:p>
+      <w:pPr>
+        <w:ind w:left="720"/>
+        <w:rPr>
+          <w:color w:val="000000" w:themeColor="text1"/>
+          <w:sz w:val="32"/>
+          <w:szCs w:val="32"/>
+        </w:rPr>
+      </w:pPr>
+    </w:p>
+    <w:p>
+      <w:pPr>
+        <w:rPr>
+          <w:b/>
+          <w:bCs/>
+          <w:color w:val="000000" w:themeColor="text1"/>
+          <w:sz w:val="32"/>
+          <w:szCs w:val="32"/>
+        </w:rPr>
+      </w:pPr>
+    </w:p>
+    <w:p>
+      <w:pPr>
+        <w:rPr>
+          <w:b/>
+          <w:bCs/>
+          <w:color w:val="000000" w:themeColor="text1"/>
+          <w:sz w:val="40"/>
+          <w:szCs w:val="40"/>
+        </w:rPr>
+      </w:pPr>
+      <w:r>
+        <w:rPr>
+          <w:b/>
+          <w:bCs/>
+          <w:noProof/>
+          <w:color w:val="000000" w:themeColor="text1"/>
+          <w:sz w:val="40"/>
+          <w:szCs w:val="40"/>
+        </w:rPr>
+        <w:lastRenderedPageBreak/>
+        <mc:AlternateContent>
+          <mc:Choice Requires="wps">
+            <w:drawing>
+              <wp:anchor distT="0" distB="0" distL="114300" distR="114300" simplePos="0" relativeHeight="251658241" behindDoc="0" locked="0" layoutInCell="1" allowOverlap="1" wp14:anchorId="611014DD" wp14:editId="4795EDBB">
+                <wp:simplePos x="0" y="0"/>
+                <wp:positionH relativeFrom="column">
+                  <wp:posOffset>64008</wp:posOffset>
+                </wp:positionH>
+                <wp:positionV relativeFrom="paragraph">
+                  <wp:posOffset>2224024</wp:posOffset>
+                </wp:positionV>
+                <wp:extent cx="164465" cy="173355"/>
+                <wp:effectExtent l="0" t="0" r="26035" b="17145"/>
+                <wp:wrapNone/>
+                <wp:docPr id="848914069" name="Flowchart: Connector 3"/>
+                <wp:cNvGraphicFramePr/>
+                <a:graphic xmlns:a="http://schemas.openxmlformats.org/drawingml/2006/main">
+                  <a:graphicData uri="http://schemas.microsoft.com/office/word/2010/wordprocessingShape">
+                    <wps:wsp>
+                      <wps:cNvSpPr/>
+                      <wps:spPr>
+                        <a:xfrm>
+                          <a:off x="0" y="0"/>
+                          <a:ext cx="164465" cy="173355"/>
+                        </a:xfrm>
+                        <a:prstGeom prst="flowChartConnector">
+                          <a:avLst/>
+                        </a:prstGeom>
+                        <a:solidFill>
+                          <a:schemeClr val="accent3">
+                            <a:lumMod val="60000"/>
+                            <a:lumOff val="40000"/>
+                          </a:schemeClr>
+                        </a:solidFill>
+                      </wps:spPr>
+                      <wps:style>
+                        <a:lnRef idx="2">
+                          <a:schemeClr val="accent1">
+                            <a:shade val="15000"/>
+                          </a:schemeClr>
+                        </a:lnRef>
+                        <a:fillRef idx="1">
+                          <a:schemeClr val="accent1"/>
+                        </a:fillRef>
+                        <a:effectRef idx="0">
+                          <a:schemeClr val="accent1"/>
+                        </a:effectRef>
+                        <a:fontRef idx="minor">
+                          <a:schemeClr val="lt1"/>
+                        </a:fontRef>
+                      </wps:style>
+                      <wps:bodyPr rot="0" spcFirstLastPara="0" vertOverflow="overflow" horzOverflow="overflow" vert="horz" wrap="square" lIns="91440" tIns="45720" rIns="91440" bIns="45720" numCol="1" spcCol="0" rtlCol="0" fromWordArt="0" anchor="ctr" anchorCtr="0" forceAA="0" compatLnSpc="1">
+                        <a:prstTxWarp prst="textNoShape">
+                          <a:avLst/>
+                        </a:prstTxWarp>
+                        <a:noAutofit/>
+                      </wps:bodyPr>
+                    </wps:wsp>
+                  </a:graphicData>
+                </a:graphic>
+              </wp:anchor>
+            </w:drawing>
+          </mc:Choice>
+          <mc:Fallback>
+            <w:pict>
+              <v:shapetype w14:anchorId="33E96394" id="_x0000_t120" coordsize="21600,21600" o:spt="120" path="m10800,qx,10800,10800,21600,21600,10800,10800,xe">
+                <v:path gradientshapeok="t" o:connecttype="custom" o:connectlocs="10800,0;3163,3163;0,10800;3163,18437;10800,21600;18437,18437;21600,10800;18437,3163" textboxrect="3163,3163,18437,18437"/>
+              </v:shapetype>
+              <v:shape id="Flowchart: Connector 3" o:spid="_x0000_s1026" type="#_x0000_t120" style="position:absolute;margin-left:5.05pt;margin-top:175.1pt;width:12.95pt;height:13.65pt;z-index:251658241;visibility:visible;mso-wrap-style:square;mso-wrap-distance-left:9pt;mso-wrap-distance-top:0;mso-wrap-distance-right:9pt;mso-wrap-distance-bottom:0;mso-position-horizontal:absolute;mso-position-horizontal-relative:text;mso-position-vertical:absolute;mso-position-vertical-relative:text;v-text-anchor:middle" o:gfxdata="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" fillcolor="#47d459 [1942]" strokecolor="#030e13 [484]" strokeweight="1.5pt">
+                <v:stroke joinstyle="miter"/>
+              </v:shape>
+            </w:pict>
+          </mc:Fallback>
+        </mc:AlternateContent>
+      </w:r>
+      <w:r>
+        <w:rPr>
+          <w:b/>
+          <w:bCs/>
+          <w:color w:val="000000" w:themeColor="text1"/>
+          <w:sz w:val="40"/>
+          <w:szCs w:val="40"/>
+        </w:rPr>
+        <w:t>Risques identifiés :</w:t>
+      </w:r>
+    </w:p>
+    <w:tbl>
+      <w:tblPr>
+        <w:tblStyle w:val="TableGrid"/>
+        <w:tblW w:w="0" w:type="auto"/>
+        <w:tblLook w:val="04A0" w:firstRow="1" w:lastRow="0" w:firstColumn="1" w:lastColumn="0" w:noHBand="0" w:noVBand="1"/>
+      </w:tblPr>
+      <w:tblGrid>
+        <w:gridCol w:w="2547"/>
+        <w:gridCol w:w="4111"/>
+        <w:gridCol w:w="3798"/>
+      </w:tblGrid>
+      <w:tr>
+        <w:tc>
+          <w:tcPr>
+            <w:tcW w:w="2547" w:type="dxa"/>
+          </w:tcPr>
+          <w:p>
+            <w:pPr>
+              <w:rPr>
+                <w:b/>
+                <w:bCs/>
+                <w:color w:val="000000" w:themeColor="text1"/>
+                <w:sz w:val="32"/>
+                <w:szCs w:val="32"/>
+              </w:rPr>
+            </w:pPr>
+            <w:r>
+              <w:rPr>
+                <w:b/>
+                <w:bCs/>
+                <w:color w:val="000000" w:themeColor="text1"/>
+                <w:sz w:val="32"/>
+                <w:szCs w:val="32"/>
+              </w:rPr>
+              <w:t>Niveau</w:t>
+            </w:r>
+          </w:p>
+        </w:tc>
+        <w:tc>
+          <w:tcPr>
+            <w:tcW w:w="4111" w:type="dxa"/>
+          </w:tcPr>
+          <w:p>
+            <w:pPr>
+              <w:rPr>
+                <w:b/>
+                <w:bCs/>
+                <w:color w:val="000000" w:themeColor="text1"/>
+                <w:sz w:val="32"/>
+                <w:szCs w:val="32"/>
+              </w:rPr>
+            </w:pPr>
+            <w:r>
+              <w:rPr>
+                <w:b/>
+                <w:bCs/>
+                <w:color w:val="000000" w:themeColor="text1"/>
+                <w:sz w:val="32"/>
+                <w:szCs w:val="32"/>
+              </w:rPr>
+              <w:t>Risque</w:t>
+            </w:r>
+          </w:p>
+        </w:tc>
+        <w:tc>
+          <w:tcPr>
+            <w:tcW w:w="3798" w:type="dxa"/>
+          </w:tcPr>
+          <w:p>
+            <w:pPr>
+              <w:rPr>
+                <w:b/>
+                <w:bCs/>
+                <w:color w:val="000000" w:themeColor="text1"/>
+                <w:sz w:val="32"/>
+                <w:szCs w:val="32"/>
+              </w:rPr>
+            </w:pPr>
+            <w:r>
+              <w:rPr>
+                <w:b/>
+                <w:bCs/>
+                <w:color w:val="000000" w:themeColor="text1"/>
+                <w:sz w:val="32"/>
+                <w:szCs w:val="32"/>
+              </w:rPr>
+              <w:t>Description</w:t>
+            </w:r>
+          </w:p>
+        </w:tc>
+      </w:tr>
+      <w:tr>
+        <w:tc>
+          <w:tcPr>
+            <w:tcW w:w="2547" w:type="dxa"/>
+          </w:tcPr>
+          <w:p>
+            <w:pPr>
+              <w:rPr>
+                <w:color w:val="000000" w:themeColor="text1"/>
+                <w:sz w:val="32"/>
+                <w:szCs w:val="32"/>
+              </w:rPr>
+            </w:pPr>
+            <w:r>
+              <w:rPr>
+                <w:b/>
+                <w:bCs/>
+                <w:color w:val="000000" w:themeColor="text1"/>
+                <w:sz w:val="32"/>
+                <w:szCs w:val="32"/>
+              </w:rPr>
+              <w:t xml:space="preserve">      </w:t>
+            </w:r>
+            <w:r>
+              <w:rPr>
+                <w:color w:val="000000" w:themeColor="text1"/>
+                <w:sz w:val="32"/>
+                <w:szCs w:val="32"/>
+              </w:rPr>
+              <w:t>Critique</w:t>
+            </w:r>
+          </w:p>
+        </w:tc>
+        <w:tc>
+          <w:tcPr>
+            <w:tcW w:w="4111" w:type="dxa"/>
+          </w:tcPr>
+          <w:p>
+            <w:pPr>
+              <w:rPr>
+                <w:color w:val="000000" w:themeColor="text1"/>
+                <w:sz w:val="32"/>
+                <w:szCs w:val="32"/>
+              </w:rPr>
+            </w:pPr>
+            <w:r>
+              <w:rPr>
+                <w:color w:val="000000" w:themeColor="text1"/>
+                <w:sz w:val="32"/>
+                <w:szCs w:val="32"/>
+              </w:rPr>
+              <w:t>SSH exposé</w:t>
+            </w:r>
+          </w:p>
+        </w:tc>
+        <w:tc>
+          <w:tcPr>
+            <w:tcW w:w="3798" w:type="dxa"/>
+          </w:tcPr>
+          <w:p>
+            <w:pPr>
+              <w:rPr>
+                <w:color w:val="000000" w:themeColor="text1"/>
+                <w:sz w:val="32"/>
+                <w:szCs w:val="32"/>
+              </w:rPr>
+            </w:pPr>
+            <w:r>
+              <w:rPr>
+                <w:color w:val="000000" w:themeColor="text1"/>
+                <w:sz w:val="32"/>
+                <w:szCs w:val="32"/>
+              </w:rPr>
+              <w:t>Possibilité de brute-force ou d’accès non autorisé</w:t>
+            </w:r>
+          </w:p>
+        </w:tc>
+      </w:tr>
+      <w:tr>
+        <w:tc>
+          <w:tcPr>
+            <w:tcW w:w="2547" w:type="dxa"/>
+          </w:tcPr>
+          <w:p>
+            <w:pPr>
+              <w:rPr>
+                <w:color w:val="000000" w:themeColor="text1"/>
+                <w:sz w:val="32"/>
+                <w:szCs w:val="32"/>
+              </w:rPr>
+            </w:pPr>
+            <w:r>
+              <w:rPr>
+                <w:b/>
+                <w:bCs/>
+                <w:noProof/>
+                <w:color w:val="000000" w:themeColor="text1"/>
+                <w:sz w:val="32"/>
+                <w:szCs w:val="32"/>
+              </w:rPr>
+              <mc:AlternateContent>
+                <mc:Choice Requires="wps">
+                  <w:drawing>
+                    <wp:anchor distT="0" distB="0" distL="114300" distR="114300" simplePos="0" relativeHeight="251658243" behindDoc="0" locked="0" layoutInCell="1" allowOverlap="1" wp14:anchorId="213C900D" wp14:editId="530BF0DC">
+                      <wp:simplePos x="0" y="0"/>
+                      <wp:positionH relativeFrom="column">
+                        <wp:posOffset>6985</wp:posOffset>
+                      </wp:positionH>
+                      <wp:positionV relativeFrom="page">
+                        <wp:posOffset>-457962</wp:posOffset>
+                      </wp:positionV>
+                      <wp:extent cx="164465" cy="173355"/>
+                      <wp:effectExtent l="0" t="0" r="26035" b="17145"/>
+                      <wp:wrapNone/>
+                      <wp:docPr id="1561760417" name="Flowchart: Connector 3"/>
+                      <wp:cNvGraphicFramePr/>
+                      <a:graphic xmlns:a="http://schemas.openxmlformats.org/drawingml/2006/main">
+                        <a:graphicData uri="http://schemas.microsoft.com/office/word/2010/wordprocessingShape">
+                          <wps:wsp>
+                            <wps:cNvSpPr/>
+                            <wps:spPr>
+                              <a:xfrm>
+                                <a:off x="0" y="0"/>
+                                <a:ext cx="164465" cy="173355"/>
+                              </a:xfrm>
+                              <a:prstGeom prst="flowChartConnector">
+                                <a:avLst/>
+                              </a:prstGeom>
+                              <a:solidFill>
+                                <a:srgbClr val="C00000"/>
+                              </a:solidFill>
+                            </wps:spPr>
+                            <wps:style>
+                              <a:lnRef idx="2">
+                                <a:schemeClr val="accent1">
+                                  <a:shade val="15000"/>
+                                </a:schemeClr>
+                              </a:lnRef>
+                              <a:fillRef idx="1">
+                                <a:schemeClr val="accent1"/>
+                              </a:fillRef>
+                              <a:effectRef idx="0">
+                                <a:schemeClr val="accent1"/>
+                              </a:effectRef>
+                              <a:fontRef idx="minor">
+                                <a:schemeClr val="lt1"/>
+                              </a:fontRef>
+                            </wps:style>
+                            <wps:txbx>
+                              <w:txbxContent>
+                                <w:p>
+                                  <w:pPr>
+                                    <w:jc w:val="center"/>
+                                  </w:pPr>
+                                </w:p>
+                              </w:txbxContent>
+                            </wps:txbx>
+                            <wps:bodyPr rot="0" spcFirstLastPara="0" vertOverflow="overflow" horzOverflow="overflow" vert="horz" wrap="square" lIns="91440" tIns="45720" rIns="91440" bIns="45720" numCol="1" spcCol="0" rtlCol="0" fromWordArt="0" anchor="ctr" anchorCtr="0" forceAA="0" compatLnSpc="1">
+                              <a:prstTxWarp prst="textNoShape">
+                                <a:avLst/>
+                              </a:prstTxWarp>
+                              <a:noAutofit/>
+                            </wps:bodyPr>
+                          </wps:wsp>
+                        </a:graphicData>
+                      </a:graphic>
+                    </wp:anchor>
+                  </w:drawing>
+                </mc:Choice>
+                <mc:Fallback>
+                  <w:pict>
+                    <v:shape w14:anchorId="213C900D" id="Flowchart: Connector 3" o:spid="_x0000_s1026" type="#_x0000_t120" style="position:absolute;margin-left:.55pt;margin-top:-36.05pt;width:12.95pt;height:13.65pt;z-index:251658243;visibility:visible;mso-wrap-style:square;mso-wrap-distance-left:9pt;mso-wrap-distance-top:0;mso-wrap-distance-right:9pt;mso-wrap-distance-bottom:0;mso-position-horizontal:absolute;mso-position-horizontal-relative:text;mso-position-vertical:absolute;mso-position-vertical-relative:page;v-text-anchor:middle" o:gfxdata="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" fillcolor="#c00000" strokecolor="#030e13 [484]" strokeweight="1.5pt">
+                      <v:stroke joinstyle="miter"/>
+                      <v:textbox>
+                        <w:txbxContent>
+                          <w:p>
+                            <w:pPr>
+                              <w:jc w:val="center"/>
+                            </w:pPr>
+                          </w:p>
+                        </w:txbxContent>
+                      </v:textbox>
+                      <w10:wrap anchory="page"/>
+                    </v:shape>
+                  </w:pict>
+                </mc:Fallback>
+              </mc:AlternateContent>
+            </w:r>
+            <w:r>
+              <w:rPr>
+                <w:b/>
+                <w:bCs/>
+                <w:color w:val="000000" w:themeColor="text1"/>
+                <w:sz w:val="32"/>
+                <w:szCs w:val="32"/>
+              </w:rPr>
+              <w:t xml:space="preserve">      </w:t>
+            </w:r>
+            <w:r>
+              <w:rPr>
+                <w:color w:val="000000" w:themeColor="text1"/>
+                <w:sz w:val="32"/>
+                <w:szCs w:val="32"/>
+              </w:rPr>
+              <w:t xml:space="preserve">Elevé </w:t>
+            </w:r>
+          </w:p>
+        </w:tc>
+        <w:tc>
+          <w:tcPr>
+            <w:tcW w:w="4111" w:type="dxa"/>
+          </w:tcPr>
+          <w:p>
+            <w:pPr>
+              <w:rPr>
+                <w:color w:val="000000" w:themeColor="text1"/>
+                <w:sz w:val="32"/>
+                <w:szCs w:val="32"/>
+              </w:rPr>
+            </w:pPr>
+            <w:r>
+              <w:rPr>
+                <w:color w:val="000000" w:themeColor="text1"/>
+                <w:sz w:val="32"/>
+                <w:szCs w:val="32"/>
+              </w:rPr>
+              <w:t>Cron actif</w:t>
+            </w:r>
+          </w:p>
+        </w:tc>
+        <w:tc>
+          <w:tcPr>
+            <w:tcW w:w="3798" w:type="dxa"/>
+          </w:tcPr>
+          <w:p>
+            <w:pPr>
+              <w:rPr>
+                <w:color w:val="000000" w:themeColor="text1"/>
+                <w:sz w:val="32"/>
+                <w:szCs w:val="32"/>
+              </w:rPr>
+            </w:pPr>
+            <w:r>
+              <w:rPr>
+                <w:color w:val="000000" w:themeColor="text1"/>
+                <w:sz w:val="32"/>
+                <w:szCs w:val="32"/>
+              </w:rPr>
+              <w:t>Risque de tâche malveillante ou persistante</w:t>
+            </w:r>
+          </w:p>
+        </w:tc>
+      </w:tr>
+      <w:tr>
+        <w:tc>
+          <w:tcPr>
+            <w:tcW w:w="2547" w:type="dxa"/>
+          </w:tcPr>
+          <w:p>
+            <w:pPr>
+              <w:rPr>
+                <w:b/>
+                <w:bCs/>
+                <w:color w:val="000000" w:themeColor="text1"/>
+                <w:sz w:val="32"/>
+                <w:szCs w:val="32"/>
+              </w:rPr>
+            </w:pPr>
+            <w:r>
+              <w:rPr>
+                <w:b/>
+                <w:bCs/>
+                <w:noProof/>
+                <w:color w:val="000000" w:themeColor="text1"/>
+                <w:sz w:val="32"/>
+                <w:szCs w:val="32"/>
+              </w:rPr>
+              <mc:AlternateContent>
+                <mc:Choice Requires="wps">
+                  <w:drawing>
+                    <wp:anchor distT="0" distB="0" distL="114300" distR="114300" simplePos="0" relativeHeight="251658240" behindDoc="0" locked="0" layoutInCell="1" allowOverlap="1" wp14:anchorId="76C7D8BB" wp14:editId="4362E35E">
+                      <wp:simplePos x="0" y="0"/>
+                      <wp:positionH relativeFrom="column">
+                        <wp:posOffset>-27305</wp:posOffset>
+                      </wp:positionH>
+                      <wp:positionV relativeFrom="page">
+                        <wp:posOffset>20955</wp:posOffset>
+                      </wp:positionV>
+                      <wp:extent cx="164465" cy="173355"/>
+                      <wp:effectExtent l="0" t="0" r="26035" b="17145"/>
+                      <wp:wrapNone/>
+                      <wp:docPr id="2138299260" name="Flowchart: Connector 3"/>
+                      <wp:cNvGraphicFramePr/>
+                      <a:graphic xmlns:a="http://schemas.openxmlformats.org/drawingml/2006/main">
+                        <a:graphicData uri="http://schemas.microsoft.com/office/word/2010/wordprocessingShape">
+                          <wps:wsp>
+                            <wps:cNvSpPr/>
+                            <wps:spPr>
+                              <a:xfrm>
+                                <a:off x="0" y="0"/>
+                                <a:ext cx="164465" cy="173355"/>
+                              </a:xfrm>
+                              <a:prstGeom prst="flowChartConnector">
+                                <a:avLst/>
+                              </a:prstGeom>
+                              <a:solidFill>
+                                <a:srgbClr val="FFC000"/>
+                              </a:solidFill>
+                            </wps:spPr>
+                            <wps:style>
+                              <a:lnRef idx="2">
+                                <a:schemeClr val="accent1">
+                                  <a:shade val="15000"/>
+                                </a:schemeClr>
+                              </a:lnRef>
+                              <a:fillRef idx="1">
+                                <a:schemeClr val="accent1"/>
+                              </a:fillRef>
+                              <a:effectRef idx="0">
+                                <a:schemeClr val="accent1"/>
+                              </a:effectRef>
+                              <a:fontRef idx="minor">
+                                <a:schemeClr val="lt1"/>
+                              </a:fontRef>
+                            </wps:style>
+                            <wps:txbx>
+                              <w:txbxContent>
+                                <w:p>
+                                  <w:pPr>
+                                    <w:jc w:val="center"/>
+                                  </w:pPr>
+                                </w:p>
+                              </w:txbxContent>
+                            </wps:txbx>
+                            <wps:bodyPr rot="0" spcFirstLastPara="0" vertOverflow="overflow" horzOverflow="overflow" vert="horz" wrap="square" lIns="91440" tIns="45720" rIns="91440" bIns="45720" numCol="1" spcCol="0" rtlCol="0" fromWordArt="0" anchor="ctr" anchorCtr="0" forceAA="0" compatLnSpc="1">
+                              <a:prstTxWarp prst="textNoShape">
+                                <a:avLst/>
+                              </a:prstTxWarp>
+                              <a:noAutofit/>
+                            </wps:bodyPr>
+                          </wps:wsp>
+                        </a:graphicData>
+                      </a:graphic>
+                    </wp:anchor>
+                  </w:drawing>
+                </mc:Choice>
+                <mc:Fallback>
+                  <w:pict>
+                    <v:shape w14:anchorId="76C7D8BB" id="_x0000_s1027" type="#_x0000_t120" style="position:absolute;margin-left:-2.15pt;margin-top:1.65pt;width:12.95pt;height:13.65pt;z-index:251658240;visibility:visible;mso-wrap-style:square;mso-wrap-distance-left:9pt;mso-wrap-distance-top:0;mso-wrap-distance-right:9pt;mso-wrap-distance-bottom:0;mso-position-horizontal:absolute;mso-position-horizontal-relative:text;mso-position-vertical:absolute;mso-position-vertical-relative:page;v-text-anchor:middle" o:gfxdata="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" fillcolor="#ffc000" strokecolor="#030e13 [484]" strokeweight="1.5pt">
+                      <v:stroke joinstyle="miter"/>
+                      <v:textbox>
+                        <w:txbxContent>
+                          <w:p>
+                            <w:pPr>
+                              <w:jc w:val="center"/>
+                            </w:pPr>
+                          </w:p>
+                        </w:txbxContent>
+                      </v:textbox>
+                      <w10:wrap anchory="page"/>
+                    </v:shape>
+                  </w:pict>
+                </mc:Fallback>
+              </mc:AlternateContent>
+            </w:r>
+            <w:r>
+              <w:rPr>
+                <w:b/>
+                <w:bCs/>
+                <w:noProof/>
+                <w:color w:val="000000" w:themeColor="text1"/>
+                <w:sz w:val="32"/>
+                <w:szCs w:val="32"/>
+              </w:rPr>
+              <mc:AlternateContent>
+                <mc:Choice Requires="wps">
+                  <w:drawing>
+                    <wp:anchor distT="0" distB="0" distL="114300" distR="114300" simplePos="0" relativeHeight="251658242" behindDoc="0" locked="0" layoutInCell="1" allowOverlap="1" wp14:anchorId="410381EC" wp14:editId="41E0502D">
+                      <wp:simplePos x="0" y="0"/>
+                      <wp:positionH relativeFrom="column">
+                        <wp:posOffset>-15494</wp:posOffset>
+                      </wp:positionH>
+                      <wp:positionV relativeFrom="page">
+                        <wp:posOffset>-686689</wp:posOffset>
+                      </wp:positionV>
+                      <wp:extent cx="164465" cy="173355"/>
+                      <wp:effectExtent l="0" t="0" r="26035" b="17145"/>
+                      <wp:wrapNone/>
+                      <wp:docPr id="1681473641" name="Flowchart: Connector 3"/>
+                      <wp:cNvGraphicFramePr/>
+                      <a:graphic xmlns:a="http://schemas.openxmlformats.org/drawingml/2006/main">
+                        <a:graphicData uri="http://schemas.microsoft.com/office/word/2010/wordprocessingShape">
+                          <wps:wsp>
+                            <wps:cNvSpPr/>
+                            <wps:spPr>
+                              <a:xfrm>
+                                <a:off x="0" y="0"/>
+                                <a:ext cx="164465" cy="173355"/>
+                              </a:xfrm>
+                              <a:prstGeom prst="flowChartConnector">
+                                <a:avLst/>
+                              </a:prstGeom>
+                              <a:solidFill>
+                                <a:schemeClr val="accent2"/>
+                              </a:solidFill>
+                            </wps:spPr>
+                            <wps:style>
+                              <a:lnRef idx="2">
+                                <a:schemeClr val="accent1">
+                                  <a:shade val="15000"/>
+                                </a:schemeClr>
+                              </a:lnRef>
+                              <a:fillRef idx="1">
+                                <a:schemeClr val="accent1"/>
+                              </a:fillRef>
+                              <a:effectRef idx="0">
+                                <a:schemeClr val="accent1"/>
+                              </a:effectRef>
+                              <a:fontRef idx="minor">
+                                <a:schemeClr val="lt1"/>
+                              </a:fontRef>
+                            </wps:style>
+                            <wps:bodyPr rot="0" spcFirstLastPara="0" vertOverflow="overflow" horzOverflow="overflow" vert="horz" wrap="square" lIns="91440" tIns="45720" rIns="91440" bIns="45720" numCol="1" spcCol="0" rtlCol="0" fromWordArt="0" anchor="ctr" anchorCtr="0" forceAA="0" compatLnSpc="1">
+                              <a:prstTxWarp prst="textNoShape">
+                                <a:avLst/>
+                              </a:prstTxWarp>
+                              <a:noAutofit/>
+                            </wps:bodyPr>
+                          </wps:wsp>
+                        </a:graphicData>
+                      </a:graphic>
+                    </wp:anchor>
+                  </w:drawing>
+                </mc:Choice>
+                <mc:Fallback>
+                  <w:pict>
+                    <v:shape w14:anchorId="78597D16" id="Flowchart: Connector 3" o:spid="_x0000_s1026" type="#_x0000_t120" style="position:absolute;margin-left:-1.2pt;margin-top:-54.05pt;width:12.95pt;height:13.65pt;z-index:251658242;visibility:visible;mso-wrap-style:square;mso-wrap-distance-left:9pt;mso-wrap-distance-top:0;mso-wrap-distance-right:9pt;mso-wrap-distance-bottom:0;mso-position-horizontal:absolute;mso-position-horizontal-relative:text;mso-position-vertical:absolute;mso-position-vertical-relative:page;v-text-anchor:middle" o:gfxdata="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" fillcolor="#e97132 [3205]" strokecolor="#030e13 [484]" strokeweight="1.5pt">
+                      <v:stroke joinstyle="miter"/>
+                      <w10:wrap anchory="page"/>
+                    </v:shape>
+                  </w:pict>
+                </mc:Fallback>
+              </mc:AlternateContent>
+            </w:r>
+            <w:r>
+              <w:rPr>
+                <w:b/>
+                <w:bCs/>
+                <w:color w:val="000000" w:themeColor="text1"/>
+                <w:sz w:val="32"/>
+                <w:szCs w:val="32"/>
+              </w:rPr>
+              <w:t xml:space="preserve">      </w:t>
+            </w:r>
+            <w:r>
+              <w:rPr>
+                <w:color w:val="000000" w:themeColor="text1"/>
+                <w:sz w:val="32"/>
+                <w:szCs w:val="32"/>
+              </w:rPr>
+              <w:t>Modéré</w:t>
+            </w:r>
+          </w:p>
+        </w:tc>
+        <w:tc>
+          <w:tcPr>
+            <w:tcW w:w="4111" w:type="dxa"/>
+          </w:tcPr>
+          <w:p>
+            <w:pPr>
+              <w:rPr>
+                <w:color w:val="000000" w:themeColor="text1"/>
+                <w:sz w:val="32"/>
+                <w:szCs w:val="32"/>
+              </w:rPr>
+            </w:pPr>
+            <w:r>
+              <w:rPr>
+                <w:color w:val="000000" w:themeColor="text1"/>
+                <w:sz w:val="32"/>
+                <w:szCs w:val="32"/>
+              </w:rPr>
+              <w:t>Services réseau multiples</w:t>
+            </w:r>
+          </w:p>
+        </w:tc>
+        <w:tc>
+          <w:tcPr>
+            <w:tcW w:w="3798" w:type="dxa"/>
+          </w:tcPr>
+          <w:p>
+            <w:pPr>
+              <w:rPr>
+                <w:color w:val="000000" w:themeColor="text1"/>
+                <w:sz w:val="32"/>
+                <w:szCs w:val="32"/>
+              </w:rPr>
+            </w:pPr>
+            <w:r>
+              <w:rPr>
+                <w:color w:val="000000" w:themeColor="text1"/>
+                <w:sz w:val="32"/>
+                <w:szCs w:val="32"/>
+              </w:rPr>
+              <w:t>Surface d’attaque élargie</w:t>
+            </w:r>
+          </w:p>
+        </w:tc>
+      </w:tr>
+      <w:tr>
+        <w:tc>
+          <w:tcPr>
+            <w:tcW w:w="2547" w:type="dxa"/>
+          </w:tcPr>
+          <w:p>
+            <w:pPr>
+              <w:rPr>
+                <w:color w:val="000000" w:themeColor="text1"/>
+                <w:sz w:val="32"/>
+                <w:szCs w:val="32"/>
+              </w:rPr>
+            </w:pPr>
+            <w:r>
+              <w:rPr>
+                <w:b/>
+                <w:bCs/>
+                <w:color w:val="000000" w:themeColor="text1"/>
+                <w:sz w:val="32"/>
+                <w:szCs w:val="32"/>
+              </w:rPr>
+              <w:t xml:space="preserve">      </w:t>
+            </w:r>
+            <w:r>
+              <w:rPr>
+                <w:color w:val="000000" w:themeColor="text1"/>
+                <w:sz w:val="32"/>
+                <w:szCs w:val="32"/>
+              </w:rPr>
+              <w:t>Faible</w:t>
+            </w:r>
+          </w:p>
+        </w:tc>
+        <w:tc>
+          <w:tcPr>
+            <w:tcW w:w="4111" w:type="dxa"/>
+          </w:tcPr>
+          <w:p>
+            <w:pPr>
+              <w:rPr>
+                <w:color w:val="000000" w:themeColor="text1"/>
+                <w:sz w:val="32"/>
+                <w:szCs w:val="32"/>
+              </w:rPr>
+            </w:pPr>
+            <w:r>
+              <w:rPr>
+                <w:color w:val="000000" w:themeColor="text1"/>
+                <w:sz w:val="32"/>
+                <w:szCs w:val="32"/>
+              </w:rPr>
+              <w:t>Services système internes</w:t>
+            </w:r>
+          </w:p>
+        </w:tc>
+        <w:tc>
+          <w:tcPr>
+            <w:tcW w:w="3798" w:type="dxa"/>
+          </w:tcPr>
+          <w:p>
+            <w:pPr>
+              <w:rPr>
+                <w:color w:val="000000" w:themeColor="text1"/>
+                <w:sz w:val="32"/>
+                <w:szCs w:val="32"/>
+              </w:rPr>
+            </w:pPr>
+            <w:r>
+              <w:rPr>
+                <w:color w:val="000000" w:themeColor="text1"/>
+                <w:sz w:val="32"/>
+                <w:szCs w:val="32"/>
+              </w:rPr>
+              <w:t>Nécessaires au bon fonctionnement</w:t>
+            </w:r>
+          </w:p>
+        </w:tc>
+      </w:tr>
+    </w:tbl>
+    <w:p>
+      <w:pPr>
+        <w:rPr>
+          <w:b/>
+          <w:bCs/>
+          <w:color w:val="000000" w:themeColor="text1"/>
+          <w:sz w:val="32"/>
+          <w:szCs w:val="32"/>
+        </w:rPr>
+      </w:pPr>
+    </w:p>
+    <w:p>
+      <w:pPr>
+        <w:pStyle w:val="ListParagraph"/>
+        <w:numPr>
+          <w:ilvl w:val="0"/>
+          <w:numId w:val="6"/>
+        </w:numPr>
+        <w:rPr>
+          <w:b/>
+          <w:bCs/>
+          <w:color w:val="000000" w:themeColor="text1"/>
+          <w:sz w:val="40"/>
+          <w:szCs w:val="40"/>
+        </w:rPr>
+      </w:pPr>
+      <w:r>
+        <w:rPr>
+          <w:b/>
+          <w:bCs/>
+          <w:color w:val="000000" w:themeColor="text1"/>
+          <w:sz w:val="40"/>
+          <w:szCs w:val="40"/>
+        </w:rPr>
+        <w:t>Analyser les ports ouverts</w:t>
+      </w:r>
+      <w:r>
+        <w:rPr>
+          <w:b/>
+          <w:bCs/>
+          <w:color w:val="000000" w:themeColor="text1"/>
+          <w:sz w:val="40"/>
+          <w:szCs w:val="40"/>
+        </w:rPr>
+        <w:t>/</w:t>
+      </w:r>
+      <w:proofErr w:type="spellStart"/>
+      <w:r>
+        <w:rPr>
+          <w:b/>
+          <w:bCs/>
+          <w:color w:val="000000" w:themeColor="text1"/>
+          <w:sz w:val="40"/>
+          <w:szCs w:val="40"/>
+        </w:rPr>
+        <w:t>nMap</w:t>
+      </w:r>
+      <w:proofErr w:type="spellEnd"/>
+      <w:r>
+        <w:rPr>
+          <w:b/>
+          <w:bCs/>
+          <w:color w:val="000000" w:themeColor="text1"/>
+          <w:sz w:val="40"/>
+          <w:szCs w:val="40"/>
+        </w:rPr>
+        <w:t xml:space="preserve"> (surface d’attaque)</w:t>
+      </w:r>
+    </w:p>
+    <w:p>
+      <w:pPr>
+        <w:rPr>
+          <w:b/>
+          <w:bCs/>
+          <w:color w:val="000000" w:themeColor="text1"/>
+          <w:sz w:val="32"/>
+          <w:szCs w:val="32"/>
+        </w:rPr>
+      </w:pPr>
+    </w:p>
+    <w:p>
+      <w:pPr>
+        <w:rPr>
+          <w:b/>
+          <w:bCs/>
+          <w:color w:val="000000" w:themeColor="text1"/>
+          <w:sz w:val="32"/>
+          <w:szCs w:val="32"/>
+        </w:rPr>
+      </w:pPr>
+      <w:r>
+        <w:rPr>
+          <w:b/>
+          <w:bCs/>
+          <w:color w:val="000000" w:themeColor="text1"/>
+          <w:sz w:val="32"/>
+          <w:szCs w:val="32"/>
+        </w:rPr>
+        <w:drawing>
+          <wp:inline distT="0" distB="0" distL="0" distR="0" wp14:anchorId="3C888A57" wp14:editId="22141634">
+            <wp:extent cx="6629400" cy="2063750"/>
+            <wp:effectExtent l="0" t="0" r="0" b="0"/>
+            <wp:docPr id="801891049" name="Picture 1"/>
+            <wp:cNvGraphicFramePr>
+              <a:graphicFrameLocks xmlns:a="http://schemas.openxmlformats.org/drawingml/2006/main" noChangeAspect="1"/>
+            </wp:cNvGraphicFramePr>
+            <a:graphic xmlns:a="http://schemas.openxmlformats.org/drawingml/2006/main">
+              <a:graphicData uri="http://schemas.openxmlformats.org/drawingml/2006/picture">
+                <pic:pic xmlns:pic="http://schemas.openxmlformats.org/drawingml/2006/picture">
+                  <pic:nvPicPr>
+                    <pic:cNvPr id="801891049" name=""/>
+                    <pic:cNvPicPr/>
+                  </pic:nvPicPr>
+                  <pic:blipFill>
+                    <a:blip r:embed="rId8"/>
+                    <a:stretch>
+                      <a:fillRect/>
+                    </a:stretch>
+                  </pic:blipFill>
+                  <pic:spPr>
+                    <a:xfrm>
+                      <a:off x="0" y="0"/>
+                      <a:ext cx="6633955" cy="2065168"/>
+                    </a:xfrm>
+                    <a:prstGeom prst="rect">
+                      <a:avLst/>
+                    </a:prstGeom>
+                  </pic:spPr>
+                </pic:pic>
+              </a:graphicData>
+            </a:graphic>
+          </wp:inline>
+        </w:drawing>
+      </w:r>
+    </w:p>
+    <w:p>
+      <w:pPr>
+        <w:rPr>
+          <w:b/>
+          <w:bCs/>
+          <w:color w:val="000000" w:themeColor="text1"/>
+          <w:sz w:val="32"/>
+          <w:szCs w:val="32"/>
+        </w:rPr>
+      </w:pPr>
+      <w:r>
+        <w:rPr>
+          <w:b/>
+          <w:bCs/>
+          <w:color w:val="000000" w:themeColor="text1"/>
+          <w:sz w:val="32"/>
+          <w:szCs w:val="32"/>
+        </w:rPr>
+        <w:drawing>
+          <wp:inline distT="0" distB="0" distL="0" distR="0" wp14:anchorId="0533602F" wp14:editId="4E5B2787">
+            <wp:extent cx="6645910" cy="603504"/>
+            <wp:effectExtent l="0" t="0" r="2540" b="6350"/>
+            <wp:docPr id="154205253" name="Picture 1"/>
+            <wp:cNvGraphicFramePr>
+              <a:graphicFrameLocks xmlns:a="http://schemas.openxmlformats.org/drawingml/2006/main" noChangeAspect="1"/>
+            </wp:cNvGraphicFramePr>
+            <a:graphic xmlns:a="http://schemas.openxmlformats.org/drawingml/2006/main">
+              <a:graphicData uri="http://schemas.openxmlformats.org/drawingml/2006/picture">
+                <pic:pic xmlns:pic="http://schemas.openxmlformats.org/drawingml/2006/picture">
+                  <pic:nvPicPr>
+                    <pic:cNvPr id="154205253" name=""/>
+                    <pic:cNvPicPr/>
+                  </pic:nvPicPr>
+                  <pic:blipFill>
+                    <a:blip r:embed="rId9"/>
+                    <a:stretch>
+                      <a:fillRect/>
+                    </a:stretch>
+                  </pic:blipFill>
+                  <pic:spPr>
+                    <a:xfrm>
+                      <a:off x="0" y="0"/>
+                      <a:ext cx="6660188" cy="604801"/>
+                    </a:xfrm>
+                    <a:prstGeom prst="rect">
+                      <a:avLst/>
+                    </a:prstGeom>
+                  </pic:spPr>
+                </pic:pic>
+              </a:graphicData>
+            </a:graphic>
+          </wp:inline>
+        </w:drawing>
+      </w:r>
+    </w:p>
+    <w:p>
+      <w:pPr>
+        <w:rPr>
+          <w:b/>
+          <w:bCs/>
+          <w:color w:val="000000" w:themeColor="text1"/>
+          <w:sz w:val="32"/>
+          <w:szCs w:val="32"/>
+        </w:rPr>
+      </w:pPr>
+      <w:r>
+        <w:rPr>
+          <w:color w:val="000000" w:themeColor="text1"/>
+          <w:sz w:val="32"/>
+          <w:szCs w:val="32"/>
+        </w:rPr>
+        <w:t xml:space="preserve">L’analyse réalisée avec </w:t>
+      </w:r>
+      <w:proofErr w:type="spellStart"/>
+      <w:r>
+        <w:rPr>
+          <w:color w:val="000000" w:themeColor="text1"/>
+          <w:sz w:val="32"/>
+          <w:szCs w:val="32"/>
+        </w:rPr>
+        <w:t>Nmap</w:t>
+      </w:r>
+      <w:proofErr w:type="spellEnd"/>
+      <w:r>
+        <w:rPr>
+          <w:color w:val="000000" w:themeColor="text1"/>
+          <w:sz w:val="32"/>
+          <w:szCs w:val="32"/>
+        </w:rPr>
+        <w:t xml:space="preserve"> sur la machine Kali Linux a révélé qu’un seul service est exposé sur le réseau : un serveur SSH fonctionnant sur le port 2222. Ce port, bien qu’alternatif au port standard 22, reste un point d’entrée critique permettant un accès distant complet au système. Le scan a également permis d’identifier la version du service (</w:t>
+      </w:r>
+      <w:proofErr w:type="spellStart"/>
+      <w:r>
+        <w:rPr>
+          <w:color w:val="000000" w:themeColor="text1"/>
+          <w:sz w:val="32"/>
+          <w:szCs w:val="32"/>
+        </w:rPr>
+        <w:t>OpenSSH</w:t>
+      </w:r>
+      <w:proofErr w:type="spellEnd"/>
+      <w:r>
+        <w:rPr>
+          <w:color w:val="000000" w:themeColor="text1"/>
+          <w:sz w:val="32"/>
+          <w:szCs w:val="32"/>
+        </w:rPr>
+        <w:t xml:space="preserve"> 10.2p1 sous Debian) ainsi que la famille du système d’exploitation (Linux kernel 5.x/6.x). L’ensemble des autres ports apparaissent filtrés, ce qui réduit la surface d’attaque mais souligne l’importance de sécuriser le service SSH, notamment en renforçant l’authentification, en limitant les adresses autorisées et en réactivant un pare-feu avec des règles strictes. Cette </w:t>
+      </w:r>
+      <w:r>
+        <w:rPr>
+          <w:color w:val="000000" w:themeColor="text1"/>
+          <w:sz w:val="32"/>
+          <w:szCs w:val="32"/>
+        </w:rPr>
+        <w:lastRenderedPageBreak/>
+        <w:t>analyse constitue une étape essentielle pour évaluer les risques liés à l’exposition de la machine sur</w:t>
+      </w:r>
+      <w:r>
+        <w:rPr>
+          <w:b/>
+          <w:bCs/>
+          <w:color w:val="000000" w:themeColor="text1"/>
+          <w:sz w:val="32"/>
+          <w:szCs w:val="32"/>
+        </w:rPr>
+        <w:t xml:space="preserve"> </w:t>
+      </w:r>
+      <w:r>
+        <w:rPr>
+          <w:color w:val="000000" w:themeColor="text1"/>
+          <w:sz w:val="32"/>
+          <w:szCs w:val="32"/>
+        </w:rPr>
+        <w:t>le réseau local et pour définir les mesures de durcissement nécessaires.</w:t>
+      </w:r>
+    </w:p>
+    <w:p>
+      <w:pPr>
+        <w:pStyle w:val="ListParagraph"/>
+        <w:numPr>
+          <w:ilvl w:val="0"/>
+          <w:numId w:val="6"/>
+        </w:numPr>
+        <w:rPr>
+          <w:b/>
+          <w:bCs/>
+          <w:color w:val="000000" w:themeColor="text1"/>
+          <w:sz w:val="40"/>
+          <w:szCs w:val="40"/>
+        </w:rPr>
+      </w:pPr>
+      <w:r>
+        <w:rPr>
+          <w:b/>
+          <w:bCs/>
+          <w:color w:val="000000" w:themeColor="text1"/>
+          <w:sz w:val="40"/>
+          <w:szCs w:val="40"/>
+        </w:rPr>
+        <w:t>Analyser la configuration SSH</w:t>
+      </w:r>
+    </w:p>
+    <w:p>
+      <w:pPr>
+        <w:rPr>
+          <w:b/>
+          <w:bCs/>
+          <w:color w:val="000000" w:themeColor="text1"/>
+          <w:sz w:val="40"/>
+          <w:szCs w:val="40"/>
+        </w:rPr>
+      </w:pPr>
+      <w:r>
+        <w:rPr>
+          <w:b/>
+          <w:bCs/>
+          <w:color w:val="000000" w:themeColor="text1"/>
+          <w:sz w:val="40"/>
+          <w:szCs w:val="40"/>
+        </w:rPr>
+        <w:drawing>
+          <wp:inline distT="0" distB="0" distL="0" distR="0" wp14:anchorId="57BD63D6" wp14:editId="418DC88A">
+            <wp:extent cx="6793992" cy="3111500"/>
+            <wp:effectExtent l="0" t="0" r="6985" b="0"/>
+            <wp:docPr id="1667563910" name="Picture 1"/>
+            <wp:cNvGraphicFramePr>
+              <a:graphicFrameLocks xmlns:a="http://schemas.openxmlformats.org/drawingml/2006/main" noChangeAspect="1"/>
+            </wp:cNvGraphicFramePr>
+            <a:graphic xmlns:a="http://schemas.openxmlformats.org/drawingml/2006/main">
+              <a:graphicData uri="http://schemas.openxmlformats.org/drawingml/2006/picture">
+                <pic:pic xmlns:pic="http://schemas.openxmlformats.org/drawingml/2006/picture">
+                  <pic:nvPicPr>
+                    <pic:cNvPr id="1667563910" name=""/>
+                    <pic:cNvPicPr/>
+                  </pic:nvPicPr>
+                  <pic:blipFill>
+                    <a:blip r:embed="rId10"/>
+                    <a:stretch>
+                      <a:fillRect/>
+                    </a:stretch>
+                  </pic:blipFill>
+                  <pic:spPr>
+                    <a:xfrm>
+                      <a:off x="0" y="0"/>
+                      <a:ext cx="6803921" cy="3116047"/>
+                    </a:xfrm>
+                    <a:prstGeom prst="rect">
+                      <a:avLst/>
+                    </a:prstGeom>
+                  </pic:spPr>
+                </pic:pic>
+              </a:graphicData>
+            </a:graphic>
+          </wp:inline>
+        </w:drawing>
+      </w:r>
+    </w:p>
+    <w:p>
+      <w:pPr>
+        <w:rPr>
+          <w:color w:val="000000" w:themeColor="text1"/>
+          <w:sz w:val="32"/>
+          <w:szCs w:val="32"/>
+        </w:rPr>
+      </w:pPr>
+      <w:r>
+        <w:rPr>
+          <w:color w:val="000000" w:themeColor="text1"/>
+          <w:sz w:val="32"/>
+          <w:szCs w:val="32"/>
+        </w:rPr>
+        <w:t>L’analyse du fichier de configuration SSH (/</w:t>
+      </w:r>
+      <w:proofErr w:type="spellStart"/>
+      <w:r>
+        <w:rPr>
+          <w:color w:val="000000" w:themeColor="text1"/>
+          <w:sz w:val="32"/>
+          <w:szCs w:val="32"/>
+        </w:rPr>
+        <w:t>etc</w:t>
+      </w:r>
+      <w:proofErr w:type="spellEnd"/>
+      <w:r>
+        <w:rPr>
+          <w:color w:val="000000" w:themeColor="text1"/>
+          <w:sz w:val="32"/>
+          <w:szCs w:val="32"/>
+        </w:rPr>
+        <w:t>/</w:t>
+      </w:r>
+      <w:proofErr w:type="spellStart"/>
+      <w:r>
+        <w:rPr>
+          <w:color w:val="000000" w:themeColor="text1"/>
+          <w:sz w:val="32"/>
+          <w:szCs w:val="32"/>
+        </w:rPr>
+        <w:t>ssh</w:t>
+      </w:r>
+      <w:proofErr w:type="spellEnd"/>
+      <w:r>
+        <w:rPr>
+          <w:color w:val="000000" w:themeColor="text1"/>
+          <w:sz w:val="32"/>
+          <w:szCs w:val="32"/>
+        </w:rPr>
+        <w:t>/</w:t>
+      </w:r>
+      <w:proofErr w:type="spellStart"/>
+      <w:r>
+        <w:rPr>
+          <w:color w:val="000000" w:themeColor="text1"/>
+          <w:sz w:val="32"/>
+          <w:szCs w:val="32"/>
+        </w:rPr>
+        <w:t>sshd_config</w:t>
+      </w:r>
+      <w:proofErr w:type="spellEnd"/>
+      <w:r>
+        <w:rPr>
+          <w:color w:val="000000" w:themeColor="text1"/>
+          <w:sz w:val="32"/>
+          <w:szCs w:val="32"/>
+        </w:rPr>
+        <w:t>) montre que le service est accessible via le port 2222, ce qui constitue une légère mesure d’obscurcissement mais ne renforce pas réellement la sécurité. Le serveur SSH autorise l’authentification par mot de passe (</w:t>
+      </w:r>
+      <w:proofErr w:type="spellStart"/>
+      <w:r>
+        <w:rPr>
+          <w:color w:val="000000" w:themeColor="text1"/>
+          <w:sz w:val="32"/>
+          <w:szCs w:val="32"/>
+        </w:rPr>
+        <w:t>PasswordAuthentication</w:t>
+      </w:r>
+      <w:proofErr w:type="spellEnd"/>
+      <w:r>
+        <w:rPr>
+          <w:color w:val="000000" w:themeColor="text1"/>
+          <w:sz w:val="32"/>
+          <w:szCs w:val="32"/>
+        </w:rPr>
+        <w:t xml:space="preserve"> yes), ce qui augmente le risque de tentatives de brute</w:t>
+      </w:r>
+      <w:r>
+        <w:rPr>
+          <w:color w:val="000000" w:themeColor="text1"/>
+          <w:sz w:val="32"/>
+          <w:szCs w:val="32"/>
+        </w:rPr>
+        <w:noBreakHyphen/>
+        <w:t>force, surtout en l’absence de pare</w:t>
+      </w:r>
+      <w:r>
+        <w:rPr>
+          <w:color w:val="000000" w:themeColor="text1"/>
+          <w:sz w:val="32"/>
+          <w:szCs w:val="32"/>
+        </w:rPr>
+        <w:noBreakHyphen/>
+        <w:t>feu actif. L’accès root est correctement désactivé (</w:t>
+      </w:r>
+      <w:proofErr w:type="spellStart"/>
+      <w:r>
+        <w:rPr>
+          <w:color w:val="000000" w:themeColor="text1"/>
+          <w:sz w:val="32"/>
+          <w:szCs w:val="32"/>
+        </w:rPr>
+        <w:t>PermitRootLogin</w:t>
+      </w:r>
+      <w:proofErr w:type="spellEnd"/>
+      <w:r>
+        <w:rPr>
+          <w:color w:val="000000" w:themeColor="text1"/>
+          <w:sz w:val="32"/>
+          <w:szCs w:val="32"/>
+        </w:rPr>
+        <w:t xml:space="preserve"> no), ce qui limite l’impact d’une compromission éventuelle. L’authentification par clé publique est activée (</w:t>
+      </w:r>
+      <w:proofErr w:type="spellStart"/>
+      <w:r>
+        <w:rPr>
+          <w:color w:val="000000" w:themeColor="text1"/>
+          <w:sz w:val="32"/>
+          <w:szCs w:val="32"/>
+        </w:rPr>
+        <w:t>PubkeyAuthentication</w:t>
+      </w:r>
+      <w:proofErr w:type="spellEnd"/>
+      <w:r>
+        <w:rPr>
+          <w:color w:val="000000" w:themeColor="text1"/>
+          <w:sz w:val="32"/>
+          <w:szCs w:val="32"/>
+        </w:rPr>
+        <w:t xml:space="preserve"> yes), mais</w:t>
+      </w:r>
+      <w:r>
+        <w:rPr>
+          <w:b/>
+          <w:bCs/>
+          <w:color w:val="000000" w:themeColor="text1"/>
+          <w:sz w:val="40"/>
+          <w:szCs w:val="40"/>
+        </w:rPr>
+        <w:t xml:space="preserve"> </w:t>
+      </w:r>
+      <w:r>
+        <w:rPr>
+          <w:color w:val="000000" w:themeColor="text1"/>
+          <w:sz w:val="32"/>
+          <w:szCs w:val="32"/>
+        </w:rPr>
+        <w:t>elle n’est pas utilisée comme méthode exclusive, ce qui réduit son efficacité. La configuration actuelle permet donc un accès fonctionnel mais insuffisamment sécurisé : le service SSH reste exposé à des attaques réseau, notamment en raison de l’absence de restrictions d’adresses IP et du maintien de</w:t>
+      </w:r>
+      <w:r>
+        <w:rPr>
+          <w:b/>
+          <w:bCs/>
+          <w:color w:val="000000" w:themeColor="text1"/>
+          <w:sz w:val="40"/>
+          <w:szCs w:val="40"/>
+        </w:rPr>
+        <w:t xml:space="preserve"> </w:t>
+      </w:r>
+      <w:r>
+        <w:rPr>
+          <w:color w:val="000000" w:themeColor="text1"/>
+          <w:sz w:val="32"/>
+          <w:szCs w:val="32"/>
+        </w:rPr>
+        <w:t>l’authentification par</w:t>
+      </w:r>
+      <w:r>
+        <w:rPr>
+          <w:b/>
+          <w:bCs/>
+          <w:color w:val="000000" w:themeColor="text1"/>
+          <w:sz w:val="40"/>
+          <w:szCs w:val="40"/>
+        </w:rPr>
+        <w:t xml:space="preserve"> </w:t>
+      </w:r>
+      <w:r>
+        <w:rPr>
+          <w:color w:val="000000" w:themeColor="text1"/>
+          <w:sz w:val="32"/>
+          <w:szCs w:val="32"/>
+        </w:rPr>
+        <w:t>mot de passe. Un durcissement est recommandé, incluant la désactivation des mots de passe, la mise en place d’un pare</w:t>
+      </w:r>
+      <w:r>
+        <w:rPr>
+          <w:color w:val="000000" w:themeColor="text1"/>
+          <w:sz w:val="32"/>
+          <w:szCs w:val="32"/>
+        </w:rPr>
+        <w:noBreakHyphen/>
+        <w:t>feu filtrant, et la limitation des connexions aux seules machines autorisées.</w:t>
+      </w:r>
+    </w:p>
+    <w:p>
+      <w:pPr>
+        <w:rPr>
+          <w:color w:val="000000" w:themeColor="text1"/>
+          <w:sz w:val="32"/>
+          <w:szCs w:val="32"/>
+        </w:rPr>
+      </w:pPr>
+    </w:p>
+    <w:p>
+      <w:pPr>
+        <w:pStyle w:val="ListParagraph"/>
+        <w:numPr>
+          <w:ilvl w:val="0"/>
+          <w:numId w:val="6"/>
+        </w:numPr>
+        <w:rPr>
+          <w:b/>
+          <w:bCs/>
+          <w:color w:val="0E2841" w:themeColor="text2"/>
+          <w:sz w:val="40"/>
+          <w:szCs w:val="40"/>
+        </w:rPr>
+      </w:pPr>
+      <w:r>
         <w:rPr>
           <w:b/>
           <w:bCs/>
@@ -3167,7 +5331,112 @@
           <w:sz w:val="44"/>
           <w:szCs w:val="44"/>
         </w:rPr>
-      </w:pPr>
+        <w:lastRenderedPageBreak/>
+        <w:t xml:space="preserve"> </w:t>
+      </w:r>
+      <w:r>
+        <w:rPr>
+          <w:b/>
+          <w:bCs/>
+          <w:color w:val="0E2841" w:themeColor="text2"/>
+          <w:sz w:val="40"/>
+          <w:szCs w:val="40"/>
+        </w:rPr>
+        <w:t>Analyser les logs système</w:t>
+      </w:r>
+    </w:p>
+    <w:p>
+      <w:pPr>
+        <w:jc w:val="center"/>
+        <w:rPr>
+          <w:b/>
+          <w:bCs/>
+          <w:color w:val="0E2841" w:themeColor="text2"/>
+          <w:sz w:val="64"/>
+          <w:szCs w:val="64"/>
+        </w:rPr>
+      </w:pPr>
+      <w:r>
+        <w:rPr>
+          <w:b/>
+          <w:bCs/>
+          <w:color w:val="0E2841" w:themeColor="text2"/>
+          <w:sz w:val="64"/>
+          <w:szCs w:val="64"/>
+        </w:rPr>
+        <w:t>Reproduction de l’environnement (déploiement de la VM Kali)</w:t>
+      </w:r>
+    </w:p>
+    <w:p>
+      <w:pPr>
+        <w:rPr>
+          <w:color w:val="0E2841" w:themeColor="text2"/>
+          <w:sz w:val="32"/>
+          <w:szCs w:val="32"/>
+        </w:rPr>
+      </w:pPr>
+      <w:r>
+        <w:rPr>
+          <w:color w:val="0E2841" w:themeColor="text2"/>
+          <w:sz w:val="32"/>
+          <w:szCs w:val="32"/>
+        </w:rPr>
+        <w:t xml:space="preserve">Afin de disposer d’un environnement de test représentatif du serveur </w:t>
+      </w:r>
+      <w:proofErr w:type="spellStart"/>
+      <w:r>
+        <w:rPr>
+          <w:color w:val="0E2841" w:themeColor="text2"/>
+          <w:sz w:val="32"/>
+          <w:szCs w:val="32"/>
+        </w:rPr>
+        <w:t>TechSud</w:t>
+      </w:r>
+      <w:proofErr w:type="spellEnd"/>
+      <w:r>
+        <w:rPr>
+          <w:color w:val="0E2841" w:themeColor="text2"/>
+          <w:sz w:val="32"/>
+          <w:szCs w:val="32"/>
+        </w:rPr>
+        <w:t>, une machine virtuelle Kali Linux a été déployée et configurée depuis zéro. L’installation a été réalisée à partir de l’image ISO officielle, suivie d’une configuration réseau en mode Bridge afin d’intégrer la VM au même réseau local que le poste d’administration. Une mise à jour complète du système a ensuite été effectuée pour garantir la présence des derniers correctifs de sécurité.</w:t>
+      </w:r>
+      <w:r>
+        <w:rPr>
+          <w:b/>
+          <w:bCs/>
+          <w:color w:val="0E2841" w:themeColor="text2"/>
+          <w:sz w:val="64"/>
+          <w:szCs w:val="64"/>
+        </w:rPr>
+        <w:t xml:space="preserve"> </w:t>
+      </w:r>
+      <w:r>
+        <w:rPr>
+          <w:color w:val="0E2841" w:themeColor="text2"/>
+          <w:sz w:val="32"/>
+          <w:szCs w:val="32"/>
+        </w:rPr>
+        <w:t>Un utilisateur administrateur dédié a été créé afin de séparer les actions d’administration des opérations système classiques, conformément aux bonnes pratiques. Enfin, le service SSH a été activé et configuré pour permettre l’accès distant à la machine, facilitant ainsi les opérations d’audit et de supervision. Cette préparation</w:t>
+      </w:r>
+      <w:r>
+        <w:rPr>
+          <w:b/>
+          <w:bCs/>
+          <w:color w:val="0E2841" w:themeColor="text2"/>
+          <w:sz w:val="64"/>
+          <w:szCs w:val="64"/>
+        </w:rPr>
+        <w:t xml:space="preserve"> </w:t>
+      </w:r>
+      <w:r>
+        <w:rPr>
+          <w:color w:val="0E2841" w:themeColor="text2"/>
+          <w:sz w:val="32"/>
+          <w:szCs w:val="32"/>
+        </w:rPr>
+        <w:t>assure un environnement propre, contrôlé et conforme aux exigences du projet, permettant d’appliquer et de tester les mesures de sécurité dans des conditions réalistes.</w:t>
+      </w:r>
     </w:p>
     <w:sectPr>
       <w:pgSz w:w="11906" w:h="16838"/>
@@ -3182,6 +5451,155 @@
 <file path=word/numbering.xml><?xml version="1.0" encoding="utf-8"?>
 <w:numbering xmlns:wpc="http://schemas.microsoft.com/office/word/2010/wordprocessingCanvas" xmlns:cx="http://schemas.microsoft.com/office/drawing/2014/chartex" xmlns:cx1="http://schemas.microsoft.com/office/drawing/2015/9/8/chartex" xmlns:cx2="http://schemas.microsoft.com/office/drawing/2015/10/21/chartex" xmlns:cx3="http://schemas.microsoft.com/office/drawing/2016/5/9/chartex" xmlns:cx4="http://schemas.microsoft.com/office/drawing/2016/5/10/chartex" xmlns:cx5="http://schemas.microsoft.com/office/drawing/2016/5/11/chartex" xmlns:cx6="http://schemas.microsoft.com/office/drawing/2016/5/12/chartex" xmlns:cx7="http://schemas.microsoft.com/office/drawing/2016/5/13/chartex" xmlns:cx8="http://schemas.microsoft.com/office/drawing/2016/5/14/chartex" xmlns:mc="http://schemas.openxmlformats.org/markup-compatibility/2006" xmlns:aink="http://schemas.microsoft.com/office/drawing/2016/ink" xmlns:am3d="http://schemas.microsoft.com/office/drawing/2017/model3d" xmlns:o="urn:schemas-microsoft-com:office:office" xmlns:oel="http://schemas.microsoft.com/office/2019/extlst" xmlns:r="http://schemas.openxmlformats.org/officeDocument/2006/relationships" xmlns:m="http://schemas.openxmlformats.org/officeDocument/2006/math" xmlns:v="urn:schemas-microsoft-com:vml" xmlns:wp14="http://schemas.microsoft.com/office/word/2010/wordprocessingDrawing" xmlns:wp="http://schemas.openxmlformats.org/drawingml/2006/wordprocessingDrawing" xmlns:w10="urn:schemas-microsoft-com:office:word" xmlns:w="http://schemas.openxmlformats.org/wordprocessingml/2006/main" xmlns:w14="http://schemas.microsoft.com/office/word/2010/wordml" xmlns:w15="http://schemas.microsoft.com/office/word/2012/wordml" xmlns:w16cex="http://schemas.microsoft.com/office/word/2018/wordml/cex" xmlns:w16cid="http://schemas.microsoft.com/office/word/2016/wordml/cid" xmlns:w16="http://schemas.microsoft.com/office/word/2018/wordml" xmlns:w16du="http://schemas.microsoft.com/office/word/2023/wordml/word16du" xmlns:w16sdtdh="http://schemas.microsoft.com/office/word/2020/wordml/sdtdatahash" xmlns:w16sdtfl="http://schemas.microsoft.com/office/word/2024/wordml/sdtformatlock" xmlns:w16se="http://schemas.microsoft.com/office/word/2015/wordml/symex" xmlns:wpg="http://schemas.microsoft.com/office/word/2010/wordprocessingGroup" xmlns:wpi="http://schemas.microsoft.com/office/word/2010/wordprocessingInk" xmlns:wne="http://schemas.microsoft.com/office/word/2006/wordml" xmlns:wps="http://schemas.microsoft.com/office/word/2010/wordprocessingShape" mc:Ignorable="w14 w15 w16se w16cid w16 w16cex w16sdtdh w16sdtfl w16du wp14">
   <w:abstractNum w:abstractNumId="0" w15:restartNumberingAfterBreak="0">
+    <w:nsid w:val="004C0523"/>
+    <w:multiLevelType w:val="multilevel"/>
+    <w:tmpl w:val="7F2AF8D2"/>
+    <w:lvl w:ilvl="0">
+      <w:start w:val="1"/>
+      <w:numFmt w:val="bullet"/>
+      <w:lvlText w:val=""/>
+      <w:lvlJc w:val="left"/>
+      <w:pPr>
+        <w:tabs>
+          <w:tab w:val="num" w:pos="720"/>
+        </w:tabs>
+        <w:ind w:left="720" w:hanging="360"/>
+      </w:pPr>
+      <w:rPr>
+        <w:rFonts w:ascii="Symbol" w:hAnsi="Symbol" w:hint="default"/>
+        <w:sz w:val="20"/>
+      </w:rPr>
+    </w:lvl>
+    <w:lvl w:ilvl="1" w:tentative="1">
+      <w:start w:val="1"/>
+      <w:numFmt w:val="bullet"/>
+      <w:lvlText w:val="o"/>
+      <w:lvlJc w:val="left"/>
+      <w:pPr>
+        <w:tabs>
+          <w:tab w:val="num" w:pos="1440"/>
+        </w:tabs>
+        <w:ind w:left="1440" w:hanging="360"/>
+      </w:pPr>
+      <w:rPr>
+        <w:rFonts w:ascii="Courier New" w:hAnsi="Courier New" w:hint="default"/>
+        <w:sz w:val="20"/>
+      </w:rPr>
+    </w:lvl>
+    <w:lvl w:ilvl="2" w:tentative="1">
+      <w:start w:val="1"/>
+      <w:numFmt w:val="bullet"/>
+      <w:lvlText w:val=""/>
+      <w:lvlJc w:val="left"/>
+      <w:pPr>
+        <w:tabs>
+          <w:tab w:val="num" w:pos="2160"/>
+        </w:tabs>
+        <w:ind w:left="2160" w:hanging="360"/>
+      </w:pPr>
+      <w:rPr>
+        <w:rFonts w:ascii="Wingdings" w:hAnsi="Wingdings" w:hint="default"/>
+        <w:sz w:val="20"/>
+      </w:rPr>
+    </w:lvl>
+    <w:lvl w:ilvl="3" w:tentative="1">
+      <w:start w:val="1"/>
+      <w:numFmt w:val="bullet"/>
+      <w:lvlText w:val=""/>
+      <w:lvlJc w:val="left"/>
+      <w:pPr>
+        <w:tabs>
+          <w:tab w:val="num" w:pos="2880"/>
+        </w:tabs>
+        <w:ind w:left="2880" w:hanging="360"/>
+      </w:pPr>
+      <w:rPr>
+        <w:rFonts w:ascii="Wingdings" w:hAnsi="Wingdings" w:hint="default"/>
+        <w:sz w:val="20"/>
+      </w:rPr>
+    </w:lvl>
+    <w:lvl w:ilvl="4" w:tentative="1">
+      <w:start w:val="1"/>
+      <w:numFmt w:val="bullet"/>
+      <w:lvlText w:val=""/>
+      <w:lvlJc w:val="left"/>
+      <w:pPr>
+        <w:tabs>
+          <w:tab w:val="num" w:pos="3600"/>
+        </w:tabs>
+        <w:ind w:left="3600" w:hanging="360"/>
+      </w:pPr>
+      <w:rPr>
+        <w:rFonts w:ascii="Wingdings" w:hAnsi="Wingdings" w:hint="default"/>
+        <w:sz w:val="20"/>
+      </w:rPr>
+    </w:lvl>
+    <w:lvl w:ilvl="5" w:tentative="1">
+      <w:start w:val="1"/>
+      <w:numFmt w:val="bullet"/>
+      <w:lvlText w:val=""/>
+      <w:lvlJc w:val="left"/>
+      <w:pPr>
+        <w:tabs>
+          <w:tab w:val="num" w:pos="4320"/>
+        </w:tabs>
+        <w:ind w:left="4320" w:hanging="360"/>
+      </w:pPr>
+      <w:rPr>
+        <w:rFonts w:ascii="Wingdings" w:hAnsi="Wingdings" w:hint="default"/>
+        <w:sz w:val="20"/>
+      </w:rPr>
+    </w:lvl>
+    <w:lvl w:ilvl="6" w:tentative="1">
+      <w:start w:val="1"/>
+      <w:numFmt w:val="bullet"/>
+      <w:lvlText w:val=""/>
+      <w:lvlJc w:val="left"/>
+      <w:pPr>
+        <w:tabs>
+          <w:tab w:val="num" w:pos="5040"/>
+        </w:tabs>
+        <w:ind w:left="5040" w:hanging="360"/>
+      </w:pPr>
+      <w:rPr>
+        <w:rFonts w:ascii="Wingdings" w:hAnsi="Wingdings" w:hint="default"/>
+        <w:sz w:val="20"/>
+      </w:rPr>
+    </w:lvl>
+    <w:lvl w:ilvl="7" w:tentative="1">
+      <w:start w:val="1"/>
+      <w:numFmt w:val="bullet"/>
+      <w:lvlText w:val=""/>
+      <w:lvlJc w:val="left"/>
+      <w:pPr>
+        <w:tabs>
+          <w:tab w:val="num" w:pos="5760"/>
+        </w:tabs>
+        <w:ind w:left="5760" w:hanging="360"/>
+      </w:pPr>
+      <w:rPr>
+        <w:rFonts w:ascii="Wingdings" w:hAnsi="Wingdings" w:hint="default"/>
+        <w:sz w:val="20"/>
+      </w:rPr>
+    </w:lvl>
+    <w:lvl w:ilvl="8" w:tentative="1">
+      <w:start w:val="1"/>
+      <w:numFmt w:val="bullet"/>
+      <w:lvlText w:val=""/>
+      <w:lvlJc w:val="left"/>
+      <w:pPr>
+        <w:tabs>
+          <w:tab w:val="num" w:pos="6480"/>
+        </w:tabs>
+        <w:ind w:left="6480" w:hanging="360"/>
+      </w:pPr>
+      <w:rPr>
+        <w:rFonts w:ascii="Wingdings" w:hAnsi="Wingdings" w:hint="default"/>
+        <w:sz w:val="20"/>
+      </w:rPr>
+    </w:lvl>
+  </w:abstractNum>
+  <w:abstractNum w:abstractNumId="1" w15:restartNumberingAfterBreak="0">
     <w:nsid w:val="0DF823AA"/>
     <w:multiLevelType w:val="multilevel"/>
     <w:tmpl w:val="C5C47424"/>
@@ -3330,7 +5748,7 @@
       </w:rPr>
     </w:lvl>
   </w:abstractNum>
-  <w:abstractNum w:abstractNumId="1" w15:restartNumberingAfterBreak="0">
+  <w:abstractNum w:abstractNumId="2" w15:restartNumberingAfterBreak="0">
     <w:nsid w:val="1A3B1254"/>
     <w:multiLevelType w:val="hybridMultilevel"/>
     <w:tmpl w:val="CFAECFA0"/>
@@ -3419,7 +5837,156 @@
       </w:pPr>
     </w:lvl>
   </w:abstractNum>
-  <w:abstractNum w:abstractNumId="2" w15:restartNumberingAfterBreak="0">
+  <w:abstractNum w:abstractNumId="3" w15:restartNumberingAfterBreak="0">
+    <w:nsid w:val="39F93CF0"/>
+    <w:multiLevelType w:val="multilevel"/>
+    <w:tmpl w:val="EEB070DE"/>
+    <w:lvl w:ilvl="0">
+      <w:start w:val="1"/>
+      <w:numFmt w:val="bullet"/>
+      <w:lvlText w:val=""/>
+      <w:lvlJc w:val="left"/>
+      <w:pPr>
+        <w:tabs>
+          <w:tab w:val="num" w:pos="720"/>
+        </w:tabs>
+        <w:ind w:left="720" w:hanging="360"/>
+      </w:pPr>
+      <w:rPr>
+        <w:rFonts w:ascii="Symbol" w:hAnsi="Symbol" w:hint="default"/>
+        <w:sz w:val="20"/>
+      </w:rPr>
+    </w:lvl>
+    <w:lvl w:ilvl="1" w:tentative="1">
+      <w:start w:val="1"/>
+      <w:numFmt w:val="bullet"/>
+      <w:lvlText w:val="o"/>
+      <w:lvlJc w:val="left"/>
+      <w:pPr>
+        <w:tabs>
+          <w:tab w:val="num" w:pos="1440"/>
+        </w:tabs>
+        <w:ind w:left="1440" w:hanging="360"/>
+      </w:pPr>
+      <w:rPr>
+        <w:rFonts w:ascii="Courier New" w:hAnsi="Courier New" w:hint="default"/>
+        <w:sz w:val="20"/>
+      </w:rPr>
+    </w:lvl>
+    <w:lvl w:ilvl="2" w:tentative="1">
+      <w:start w:val="1"/>
+      <w:numFmt w:val="bullet"/>
+      <w:lvlText w:val=""/>
+      <w:lvlJc w:val="left"/>
+      <w:pPr>
+        <w:tabs>
+          <w:tab w:val="num" w:pos="2160"/>
+        </w:tabs>
+        <w:ind w:left="2160" w:hanging="360"/>
+      </w:pPr>
+      <w:rPr>
+        <w:rFonts w:ascii="Wingdings" w:hAnsi="Wingdings" w:hint="default"/>
+        <w:sz w:val="20"/>
+      </w:rPr>
+    </w:lvl>
+    <w:lvl w:ilvl="3" w:tentative="1">
+      <w:start w:val="1"/>
+      <w:numFmt w:val="bullet"/>
+      <w:lvlText w:val=""/>
+      <w:lvlJc w:val="left"/>
+      <w:pPr>
+        <w:tabs>
+          <w:tab w:val="num" w:pos="2880"/>
+        </w:tabs>
+        <w:ind w:left="2880" w:hanging="360"/>
+      </w:pPr>
+      <w:rPr>
+        <w:rFonts w:ascii="Wingdings" w:hAnsi="Wingdings" w:hint="default"/>
+        <w:sz w:val="20"/>
+      </w:rPr>
+    </w:lvl>
+    <w:lvl w:ilvl="4" w:tentative="1">
+      <w:start w:val="1"/>
+      <w:numFmt w:val="bullet"/>
+      <w:lvlText w:val=""/>
+      <w:lvlJc w:val="left"/>
+      <w:pPr>
+        <w:tabs>
+          <w:tab w:val="num" w:pos="3600"/>
+        </w:tabs>
+        <w:ind w:left="3600" w:hanging="360"/>
+      </w:pPr>
+      <w:rPr>
+        <w:rFonts w:ascii="Wingdings" w:hAnsi="Wingdings" w:hint="default"/>
+        <w:sz w:val="20"/>
+      </w:rPr>
+    </w:lvl>
+    <w:lvl w:ilvl="5" w:tentative="1">
+      <w:start w:val="1"/>
+      <w:numFmt w:val="bullet"/>
+      <w:lvlText w:val=""/>
+      <w:lvlJc w:val="left"/>
+      <w:pPr>
+        <w:tabs>
+          <w:tab w:val="num" w:pos="4320"/>
+        </w:tabs>
+        <w:ind w:left="4320" w:hanging="360"/>
+      </w:pPr>
+      <w:rPr>
+        <w:rFonts w:ascii="Wingdings" w:hAnsi="Wingdings" w:hint="default"/>
+        <w:sz w:val="20"/>
+      </w:rPr>
+    </w:lvl>
+    <w:lvl w:ilvl="6" w:tentative="1">
+      <w:start w:val="1"/>
+      <w:numFmt w:val="bullet"/>
+      <w:lvlText w:val=""/>
+      <w:lvlJc w:val="left"/>
+      <w:pPr>
+        <w:tabs>
+          <w:tab w:val="num" w:pos="5040"/>
+        </w:tabs>
+        <w:ind w:left="5040" w:hanging="360"/>
+      </w:pPr>
+      <w:rPr>
+        <w:rFonts w:ascii="Wingdings" w:hAnsi="Wingdings" w:hint="default"/>
+        <w:sz w:val="20"/>
+      </w:rPr>
+    </w:lvl>
+    <w:lvl w:ilvl="7" w:tentative="1">
+      <w:start w:val="1"/>
+      <w:numFmt w:val="bullet"/>
+      <w:lvlText w:val=""/>
+      <w:lvlJc w:val="left"/>
+      <w:pPr>
+        <w:tabs>
+          <w:tab w:val="num" w:pos="5760"/>
+        </w:tabs>
+        <w:ind w:left="5760" w:hanging="360"/>
+      </w:pPr>
+      <w:rPr>
+        <w:rFonts w:ascii="Wingdings" w:hAnsi="Wingdings" w:hint="default"/>
+        <w:sz w:val="20"/>
+      </w:rPr>
+    </w:lvl>
+    <w:lvl w:ilvl="8" w:tentative="1">
+      <w:start w:val="1"/>
+      <w:numFmt w:val="bullet"/>
+      <w:lvlText w:val=""/>
+      <w:lvlJc w:val="left"/>
+      <w:pPr>
+        <w:tabs>
+          <w:tab w:val="num" w:pos="6480"/>
+        </w:tabs>
+        <w:ind w:left="6480" w:hanging="360"/>
+      </w:pPr>
+      <w:rPr>
+        <w:rFonts w:ascii="Wingdings" w:hAnsi="Wingdings" w:hint="default"/>
+        <w:sz w:val="20"/>
+      </w:rPr>
+    </w:lvl>
+  </w:abstractNum>
+  <w:abstractNum w:abstractNumId="4" w15:restartNumberingAfterBreak="0">
     <w:nsid w:val="417E3274"/>
     <w:multiLevelType w:val="hybridMultilevel"/>
     <w:tmpl w:val="F9B0706A"/>
@@ -3532,10 +6099,10 @@
       </w:rPr>
     </w:lvl>
   </w:abstractNum>
-  <w:abstractNum w:abstractNumId="3" w15:restartNumberingAfterBreak="0">
+  <w:abstractNum w:abstractNumId="5" w15:restartNumberingAfterBreak="0">
     <w:nsid w:val="43CB7F9D"/>
     <w:multiLevelType w:val="hybridMultilevel"/>
-    <w:tmpl w:val="3322FC6A"/>
+    <w:tmpl w:val="B65453AA"/>
     <w:lvl w:ilvl="0" w:tplc="040C000B">
       <w:start w:val="1"/>
       <w:numFmt w:val="bullet"/>
@@ -3645,7 +6212,7 @@
       </w:rPr>
     </w:lvl>
   </w:abstractNum>
-  <w:abstractNum w:abstractNumId="4" w15:restartNumberingAfterBreak="0">
+  <w:abstractNum w:abstractNumId="6" w15:restartNumberingAfterBreak="0">
     <w:nsid w:val="48ED6EEC"/>
     <w:multiLevelType w:val="multilevel"/>
     <w:tmpl w:val="696604AA"/>
@@ -3794,7 +6361,7 @@
       </w:rPr>
     </w:lvl>
   </w:abstractNum>
-  <w:abstractNum w:abstractNumId="5" w15:restartNumberingAfterBreak="0">
+  <w:abstractNum w:abstractNumId="7" w15:restartNumberingAfterBreak="0">
     <w:nsid w:val="72335CBD"/>
     <w:multiLevelType w:val="hybridMultilevel"/>
     <w:tmpl w:val="06FA1446"/>
@@ -3907,7 +6474,7 @@
       </w:rPr>
     </w:lvl>
   </w:abstractNum>
-  <w:abstractNum w:abstractNumId="6" w15:restartNumberingAfterBreak="0">
+  <w:abstractNum w:abstractNumId="8" w15:restartNumberingAfterBreak="0">
     <w:nsid w:val="74F05E06"/>
     <w:multiLevelType w:val="hybridMultilevel"/>
     <w:tmpl w:val="4D788512"/>
@@ -4020,7 +6587,7 @@
       </w:rPr>
     </w:lvl>
   </w:abstractNum>
-  <w:abstractNum w:abstractNumId="7" w15:restartNumberingAfterBreak="0">
+  <w:abstractNum w:abstractNumId="9" w15:restartNumberingAfterBreak="0">
     <w:nsid w:val="799525A6"/>
     <w:multiLevelType w:val="multilevel"/>
     <w:tmpl w:val="20F8346E"/>
@@ -4169,29 +6736,35 @@
       </w:rPr>
     </w:lvl>
   </w:abstractNum>
-  <w:num w:numId="1" w16cid:durableId="201139825">
+  <w:num w:numId="1" w16cid:durableId="1392077383">
+    <w:abstractNumId w:val="9"/>
+  </w:num>
+  <w:num w:numId="2" w16cid:durableId="201139825">
+    <w:abstractNumId w:val="1"/>
+  </w:num>
+  <w:num w:numId="3" w16cid:durableId="214852887">
+    <w:abstractNumId w:val="7"/>
+  </w:num>
+  <w:num w:numId="4" w16cid:durableId="470489027">
+    <w:abstractNumId w:val="4"/>
+  </w:num>
+  <w:num w:numId="5" w16cid:durableId="476841645">
+    <w:abstractNumId w:val="2"/>
+  </w:num>
+  <w:num w:numId="6" w16cid:durableId="583686798">
+    <w:abstractNumId w:val="5"/>
+  </w:num>
+  <w:num w:numId="7" w16cid:durableId="672728186">
+    <w:abstractNumId w:val="6"/>
+  </w:num>
+  <w:num w:numId="8" w16cid:durableId="733695687">
+    <w:abstractNumId w:val="8"/>
+  </w:num>
+  <w:num w:numId="9" w16cid:durableId="282536266">
     <w:abstractNumId w:val="0"/>
   </w:num>
-  <w:num w:numId="2" w16cid:durableId="214852887">
-    <w:abstractNumId w:val="5"/>
-  </w:num>
-  <w:num w:numId="3" w16cid:durableId="470489027">
-    <w:abstractNumId w:val="2"/>
-  </w:num>
-  <w:num w:numId="4" w16cid:durableId="476841645">
-    <w:abstractNumId w:val="1"/>
-  </w:num>
-  <w:num w:numId="5" w16cid:durableId="733695687">
-    <w:abstractNumId w:val="6"/>
-  </w:num>
-  <w:num w:numId="6" w16cid:durableId="583686798">
+  <w:num w:numId="10" w16cid:durableId="1081104308">
     <w:abstractNumId w:val="3"/>
-  </w:num>
-  <w:num w:numId="7" w16cid:durableId="1392077383">
-    <w:abstractNumId w:val="7"/>
-  </w:num>
-  <w:num w:numId="8" w16cid:durableId="672728186">
-    <w:abstractNumId w:val="4"/>
   </w:num>
 </w:numbering>
 </file>
@@ -4799,7 +7372,6 @@
   <w:style w:type="character" w:default="1" w:styleId="DefaultParagraphFont">
     <w:name w:val="Default Paragraph Font"/>
     <w:uiPriority w:val="1"/>
-    <w:semiHidden/>
     <w:unhideWhenUsed/>
   </w:style>
   <w:style w:type="table" w:default="1" w:styleId="TableNormal">

</xml_diff>